<commit_message>
Update CV data and rebuild site
</commit_message>
<xml_diff>
--- a/Shahriarirad_Reza_CV.docx
+++ b/Shahriarirad_Reza_CV.docx
@@ -840,7 +840,7 @@
                 <w:color w:val="1F3864"/>
                 <w:sz w:val="20"/>
               </w:rPr>
-              <w:t>194</w:t>
+              <w:t>195</w:t>
             </w:r>
           </w:p>
         </w:tc>
@@ -900,7 +900,7 @@
                 <w:color w:val="1F3864"/>
                 <w:sz w:val="20"/>
               </w:rPr>
-              <w:t>22</w:t>
+              <w:t>23</w:t>
             </w:r>
           </w:p>
         </w:tc>
@@ -12176,6 +12176,76 @@
           <w:sz w:val="18"/>
         </w:rPr>
         <w:t xml:space="preserve"> (2015)</w:t>
+      </w:r>
+    </w:p>
+    <w:p>
+      <w:pPr>
+        <w:spacing w:after="20"/>
+        <w:ind w:left="432" w:hanging="432"/>
+      </w:pPr>
+      <w:r>
+        <w:rPr>
+          <w:rFonts w:ascii="Arial" w:hAnsi="Arial"/>
+          <w:b/>
+          <w:i w:val="0"/>
+          <w:color w:val="1F3864"/>
+          <w:sz w:val="18"/>
+        </w:rPr>
+        <w:t xml:space="preserve">195. </w:t>
+      </w:r>
+      <w:r>
+        <w:rPr>
+          <w:rFonts w:ascii="Arial" w:hAnsi="Arial"/>
+          <w:b w:val="0"/>
+          <w:i w:val="0"/>
+          <w:sz w:val="18"/>
+        </w:rPr>
+      </w:r>
+      <w:r>
+        <w:rPr>
+          <w:rFonts w:ascii="Arial" w:hAnsi="Arial"/>
+          <w:b/>
+          <w:i w:val="0"/>
+          <w:sz w:val="18"/>
+        </w:rPr>
+        <w:t>Shahriarirad R*</w:t>
+      </w:r>
+      <w:r>
+        <w:rPr>
+          <w:rFonts w:ascii="Arial" w:hAnsi="Arial"/>
+          <w:b w:val="0"/>
+          <w:i w:val="0"/>
+          <w:sz w:val="18"/>
+        </w:rPr>
+        <w:t>, Test A</w:t>
+      </w:r>
+      <w:r>
+        <w:rPr>
+          <w:rFonts w:ascii="Arial" w:hAnsi="Arial"/>
+          <w:b w:val="0"/>
+          <w:i w:val="0"/>
+          <w:sz w:val="18"/>
+        </w:rPr>
+        <w:t xml:space="preserve"> Testing. </w:t>
+      </w:r>
+      <w:r>
+        <w:rPr>
+          <w:rFonts w:ascii="Arial" w:hAnsi="Arial"/>
+          <w:b w:val="0"/>
+          <w:i/>
+          <w:sz w:val="18"/>
+        </w:rPr>
+        <w:t>Test Journal</w:t>
+      </w:r>
+      <w:r>
+        <w:rPr>
+          <w:rFonts w:ascii="Arial" w:hAnsi="Arial"/>
+          <w:b w:val="0"/>
+          <w:i w:val="0"/>
+          <w:color w:val="6B84A0"/>
+          <w:sz w:val="18"/>
+        </w:rPr>
+        <w:t xml:space="preserve"> (2026)</w:t>
       </w:r>
     </w:p>
     <w:p>

</xml_diff>

<commit_message>
Update open source section, CV design, nav labels, and filters
</commit_message>
<xml_diff>
--- a/Shahriarirad_Reza_CV.docx
+++ b/Shahriarirad_Reza_CV.docx
@@ -31,7 +31,7 @@
           <w:color w:val="5D6878"/>
           <w:sz w:val="19"/>
         </w:rPr>
-        <w:t>Research Fellow | Surgery Innovation Center · Mayo Clinic | Rochester, MN</w:t>
+        <w:t>Research Fellow | Department of Surgery - Surgical Innovation · Mayo Clinic | Rochester, MN</w:t>
       </w:r>
     </w:p>
     <w:p>
@@ -68,9 +68,17 @@
     </w:p>
     <w:p>
       <w:pPr>
+        <w:spacing w:before="20" w:after="120"/>
+        <w:pBdr>
+          <w:bottom w:val="single" w:sz="8" w:space="1" w:color="B8953A"/>
+        </w:pBdr>
+      </w:pPr>
+    </w:p>
+    <w:p>
+      <w:pPr>
         <w:spacing w:before="180" w:after="60"/>
         <w:pBdr>
-          <w:bottom w:val="single" w:sz="6" w:space="1" w:color="1F3864"/>
+          <w:bottom w:val="single" w:sz="6" w:space="1" w:color="B8953A"/>
         </w:pBdr>
       </w:pPr>
       <w:r>
@@ -89,6 +97,7 @@
         <w:tblStyle w:val="TableGrid"/>
         <w:tblW w:type="auto" w:w="0"/>
         <w:jc w:val="left"/>
+        <w:tblLayout w:type="autofit"/>
         <w:tblLook w:firstColumn="1" w:firstRow="1" w:lastColumn="0" w:lastRow="0" w:noHBand="0" w:noVBand="1" w:val="04A0"/>
       </w:tblPr>
       <w:tblGrid>
@@ -450,14 +459,14 @@
     </w:tbl>
     <w:p>
       <w:pPr>
-        <w:spacing w:after="40"/>
+        <w:spacing w:after="40" w:before="0"/>
       </w:pPr>
     </w:p>
     <w:p>
       <w:pPr>
         <w:spacing w:before="180" w:after="60"/>
         <w:pBdr>
-          <w:bottom w:val="single" w:sz="6" w:space="1" w:color="1F3864"/>
+          <w:bottom w:val="single" w:sz="6" w:space="1" w:color="B8953A"/>
         </w:pBdr>
       </w:pPr>
       <w:r>
@@ -476,6 +485,7 @@
         <w:tblStyle w:val="TableGrid"/>
         <w:tblW w:type="auto" w:w="0"/>
         <w:jc w:val="left"/>
+        <w:tblLayout w:type="autofit"/>
         <w:tblLook w:firstColumn="1" w:firstRow="1" w:lastColumn="0" w:lastRow="0" w:noHBand="0" w:noVBand="1" w:val="04A0"/>
       </w:tblPr>
       <w:tblGrid>
@@ -753,14 +763,14 @@
     </w:tbl>
     <w:p>
       <w:pPr>
-        <w:spacing w:after="40"/>
+        <w:spacing w:after="40" w:before="0"/>
       </w:pPr>
     </w:p>
     <w:p>
       <w:pPr>
         <w:spacing w:before="180" w:after="60"/>
         <w:pBdr>
-          <w:bottom w:val="single" w:sz="6" w:space="1" w:color="1F3864"/>
+          <w:bottom w:val="single" w:sz="6" w:space="1" w:color="B8953A"/>
         </w:pBdr>
       </w:pPr>
       <w:r>
@@ -779,6 +789,7 @@
         <w:tblStyle w:val="TableGrid"/>
         <w:tblW w:type="auto" w:w="0"/>
         <w:jc w:val="left"/>
+        <w:tblLayout w:type="autofit"/>
         <w:tblLook w:firstColumn="1" w:firstRow="1" w:lastColumn="0" w:lastRow="0" w:noHBand="0" w:noVBand="1" w:val="04A0"/>
       </w:tblPr>
       <w:tblGrid>
@@ -1225,14 +1236,14 @@
     </w:tbl>
     <w:p>
       <w:pPr>
-        <w:spacing w:after="40"/>
+        <w:spacing w:after="40" w:before="0"/>
       </w:pPr>
     </w:p>
     <w:p>
       <w:pPr>
         <w:spacing w:before="180" w:after="60"/>
         <w:pBdr>
-          <w:bottom w:val="single" w:sz="6" w:space="1" w:color="1F3864"/>
+          <w:bottom w:val="single" w:sz="6" w:space="1" w:color="B8953A"/>
         </w:pBdr>
       </w:pPr>
       <w:r>
@@ -1251,6 +1262,7 @@
         <w:tblStyle w:val="TableGrid"/>
         <w:tblW w:type="auto" w:w="0"/>
         <w:jc w:val="left"/>
+        <w:tblLayout w:type="autofit"/>
         <w:tblLook w:firstColumn="1" w:firstRow="1" w:lastColumn="0" w:lastRow="0" w:noHBand="0" w:noVBand="1" w:val="04A0"/>
       </w:tblPr>
       <w:tblGrid>
@@ -1462,14 +1474,14 @@
     </w:tbl>
     <w:p>
       <w:pPr>
-        <w:spacing w:after="40"/>
+        <w:spacing w:after="40" w:before="0"/>
       </w:pPr>
     </w:p>
     <w:p>
       <w:pPr>
         <w:spacing w:before="180" w:after="60"/>
         <w:pBdr>
-          <w:bottom w:val="single" w:sz="6" w:space="1" w:color="1F3864"/>
+          <w:bottom w:val="single" w:sz="6" w:space="1" w:color="B8953A"/>
         </w:pBdr>
       </w:pPr>
       <w:r>
@@ -1488,6 +1500,7 @@
         <w:tblStyle w:val="TableGrid"/>
         <w:tblW w:type="auto" w:w="0"/>
         <w:jc w:val="left"/>
+        <w:tblLayout w:type="autofit"/>
         <w:tblLook w:firstColumn="1" w:firstRow="1" w:lastColumn="0" w:lastRow="0" w:noHBand="0" w:noVBand="1" w:val="04A0"/>
       </w:tblPr>
       <w:tblGrid>
@@ -1679,14 +1692,14 @@
     </w:tbl>
     <w:p>
       <w:pPr>
-        <w:spacing w:after="40"/>
+        <w:spacing w:after="40" w:before="0"/>
       </w:pPr>
     </w:p>
     <w:p>
       <w:pPr>
         <w:spacing w:before="180" w:after="60"/>
         <w:pBdr>
-          <w:bottom w:val="single" w:sz="6" w:space="1" w:color="1F3864"/>
+          <w:bottom w:val="single" w:sz="6" w:space="1" w:color="B8953A"/>
         </w:pBdr>
       </w:pPr>
       <w:r>
@@ -1705,6 +1718,7 @@
         <w:tblStyle w:val="TableGrid"/>
         <w:tblW w:type="auto" w:w="0"/>
         <w:jc w:val="left"/>
+        <w:tblLayout w:type="autofit"/>
         <w:tblLook w:firstColumn="1" w:firstRow="1" w:lastColumn="0" w:lastRow="0" w:noHBand="0" w:noVBand="1" w:val="04A0"/>
       </w:tblPr>
       <w:tblGrid>
@@ -1802,14 +1816,14 @@
     </w:tbl>
     <w:p>
       <w:pPr>
-        <w:spacing w:after="40"/>
+        <w:spacing w:after="40" w:before="0"/>
       </w:pPr>
     </w:p>
     <w:p>
       <w:pPr>
         <w:spacing w:before="180" w:after="60"/>
         <w:pBdr>
-          <w:bottom w:val="single" w:sz="6" w:space="1" w:color="1F3864"/>
+          <w:bottom w:val="single" w:sz="6" w:space="1" w:color="B8953A"/>
         </w:pBdr>
       </w:pPr>
       <w:r>
@@ -1828,6 +1842,7 @@
         <w:tblStyle w:val="TableGrid"/>
         <w:tblW w:type="auto" w:w="0"/>
         <w:jc w:val="left"/>
+        <w:tblLayout w:type="autofit"/>
         <w:tblLook w:firstColumn="1" w:firstRow="1" w:lastColumn="0" w:lastRow="0" w:noHBand="0" w:noVBand="1" w:val="04A0"/>
       </w:tblPr>
       <w:tblGrid>
@@ -2105,14 +2120,14 @@
     </w:tbl>
     <w:p>
       <w:pPr>
-        <w:spacing w:after="40"/>
+        <w:spacing w:after="40" w:before="0"/>
       </w:pPr>
     </w:p>
     <w:p>
       <w:pPr>
         <w:spacing w:before="180" w:after="60"/>
         <w:pBdr>
-          <w:bottom w:val="single" w:sz="6" w:space="1" w:color="1F3864"/>
+          <w:bottom w:val="single" w:sz="6" w:space="1" w:color="B8953A"/>
         </w:pBdr>
       </w:pPr>
       <w:r>
@@ -2131,6 +2146,7 @@
         <w:tblStyle w:val="TableGrid"/>
         <w:tblW w:type="auto" w:w="0"/>
         <w:jc w:val="left"/>
+        <w:tblLayout w:type="autofit"/>
         <w:tblLook w:firstColumn="1" w:firstRow="1" w:lastColumn="0" w:lastRow="0" w:noHBand="0" w:noVBand="1" w:val="04A0"/>
       </w:tblPr>
       <w:tblGrid>
@@ -2448,14 +2464,14 @@
     </w:tbl>
     <w:p>
       <w:pPr>
-        <w:spacing w:after="40"/>
+        <w:spacing w:after="40" w:before="0"/>
       </w:pPr>
     </w:p>
     <w:p>
       <w:pPr>
         <w:spacing w:before="180" w:after="60"/>
         <w:pBdr>
-          <w:bottom w:val="single" w:sz="6" w:space="1" w:color="1F3864"/>
+          <w:bottom w:val="single" w:sz="6" w:space="1" w:color="B8953A"/>
         </w:pBdr>
       </w:pPr>
       <w:r>
@@ -2474,6 +2490,7 @@
         <w:tblStyle w:val="TableGrid"/>
         <w:tblW w:type="auto" w:w="0"/>
         <w:jc w:val="left"/>
+        <w:tblLayout w:type="autofit"/>
         <w:tblLook w:firstColumn="1" w:firstRow="1" w:lastColumn="0" w:lastRow="0" w:noHBand="0" w:noVBand="1" w:val="04A0"/>
       </w:tblPr>
       <w:tblGrid>
@@ -2685,7 +2702,7 @@
     </w:tbl>
     <w:p>
       <w:pPr>
-        <w:spacing w:after="40"/>
+        <w:spacing w:after="40" w:before="0"/>
       </w:pPr>
     </w:p>
     <w:p>
@@ -2706,7 +2723,7 @@
       <w:pPr>
         <w:spacing w:before="180" w:after="60"/>
         <w:pBdr>
-          <w:bottom w:val="single" w:sz="6" w:space="1" w:color="1F3864"/>
+          <w:bottom w:val="single" w:sz="6" w:space="1" w:color="B8953A"/>
         </w:pBdr>
       </w:pPr>
       <w:r>
@@ -2725,6 +2742,7 @@
         <w:tblStyle w:val="TableGrid"/>
         <w:tblW w:type="auto" w:w="0"/>
         <w:jc w:val="left"/>
+        <w:tblLayout w:type="autofit"/>
         <w:tblLook w:firstColumn="1" w:firstRow="1" w:lastColumn="0" w:lastRow="0" w:noHBand="0" w:noVBand="1" w:val="04A0"/>
       </w:tblPr>
       <w:tblGrid>
@@ -2866,14 +2884,14 @@
     </w:tbl>
     <w:p>
       <w:pPr>
-        <w:spacing w:after="40"/>
+        <w:spacing w:after="40" w:before="0"/>
       </w:pPr>
     </w:p>
     <w:p>
       <w:pPr>
         <w:spacing w:before="180" w:after="60"/>
         <w:pBdr>
-          <w:bottom w:val="single" w:sz="6" w:space="1" w:color="1F3864"/>
+          <w:bottom w:val="single" w:sz="6" w:space="1" w:color="B8953A"/>
         </w:pBdr>
       </w:pPr>
       <w:r>
@@ -2892,6 +2910,7 @@
         <w:tblStyle w:val="TableGrid"/>
         <w:tblW w:type="auto" w:w="0"/>
         <w:jc w:val="left"/>
+        <w:tblLayout w:type="autofit"/>
         <w:tblLook w:firstColumn="1" w:firstRow="1" w:lastColumn="0" w:lastRow="0" w:noHBand="0" w:noVBand="1" w:val="04A0"/>
       </w:tblPr>
       <w:tblGrid>
@@ -2960,7 +2979,7 @@
                 <w:i w:val="0"/>
                 <w:sz w:val="17"/>
               </w:rPr>
-              <w:t>Interests</w:t>
+              <w:t>Hobbies</w:t>
             </w:r>
           </w:p>
         </w:tc>
@@ -2989,14 +3008,14 @@
     </w:tbl>
     <w:p>
       <w:pPr>
-        <w:spacing w:after="40"/>
+        <w:spacing w:after="40" w:before="0"/>
       </w:pPr>
     </w:p>
     <w:p>
       <w:pPr>
         <w:spacing w:before="180" w:after="60"/>
         <w:pBdr>
-          <w:bottom w:val="single" w:sz="6" w:space="1" w:color="1F3864"/>
+          <w:bottom w:val="single" w:sz="6" w:space="1" w:color="B8953A"/>
         </w:pBdr>
       </w:pPr>
       <w:r>
@@ -3015,6 +3034,7 @@
         <w:tblStyle w:val="TableGrid"/>
         <w:tblW w:type="auto" w:w="0"/>
         <w:jc w:val="left"/>
+        <w:tblLayout w:type="autofit"/>
         <w:tblLook w:firstColumn="1" w:firstRow="1" w:lastColumn="0" w:lastRow="0" w:noHBand="0" w:noVBand="1" w:val="04A0"/>
       </w:tblPr>
       <w:tblGrid>
@@ -3894,7 +3914,7 @@
     </w:tbl>
     <w:p>
       <w:pPr>
-        <w:spacing w:after="40"/>
+        <w:spacing w:after="40" w:before="0"/>
       </w:pPr>
     </w:p>
     <w:p>
@@ -3911,7 +3931,7 @@
       <w:pPr>
         <w:spacing w:before="180" w:after="60"/>
         <w:pBdr>
-          <w:bottom w:val="single" w:sz="6" w:space="1" w:color="1F3864"/>
+          <w:bottom w:val="single" w:sz="6" w:space="1" w:color="B8953A"/>
         </w:pBdr>
       </w:pPr>
       <w:r>
@@ -16992,7 +17012,7 @@
       <w:pPr>
         <w:spacing w:before="180" w:after="60"/>
         <w:pBdr>
-          <w:bottom w:val="single" w:sz="6" w:space="1" w:color="1F3864"/>
+          <w:bottom w:val="single" w:sz="6" w:space="1" w:color="B8953A"/>
         </w:pBdr>
       </w:pPr>
       <w:r>
@@ -17011,6 +17031,7 @@
         <w:tblStyle w:val="TableGrid"/>
         <w:tblW w:type="auto" w:w="0"/>
         <w:jc w:val="left"/>
+        <w:tblLayout w:type="autofit"/>
         <w:tblLook w:firstColumn="1" w:firstRow="1" w:lastColumn="0" w:lastRow="0" w:noHBand="0" w:noVBand="1" w:val="04A0"/>
       </w:tblPr>
       <w:tblGrid>
@@ -18515,7 +18536,7 @@
     </w:tbl>
     <w:p>
       <w:pPr>
-        <w:spacing w:after="40"/>
+        <w:spacing w:after="40" w:before="0"/>
       </w:pPr>
     </w:p>
     <w:p>
@@ -18532,7 +18553,7 @@
       <w:pPr>
         <w:spacing w:before="180" w:after="60"/>
         <w:pBdr>
-          <w:bottom w:val="single" w:sz="6" w:space="1" w:color="1F3864"/>
+          <w:bottom w:val="single" w:sz="6" w:space="1" w:color="B8953A"/>
         </w:pBdr>
       </w:pPr>
       <w:r>
@@ -18551,6 +18572,7 @@
         <w:tblStyle w:val="TableGrid"/>
         <w:tblW w:type="auto" w:w="0"/>
         <w:jc w:val="left"/>
+        <w:tblLayout w:type="autofit"/>
         <w:tblLook w:firstColumn="1" w:firstRow="1" w:lastColumn="0" w:lastRow="0" w:noHBand="0" w:noVBand="1" w:val="04A0"/>
       </w:tblPr>
       <w:tblGrid>
@@ -20927,7 +20949,7 @@
     </w:tbl>
     <w:p>
       <w:pPr>
-        <w:spacing w:after="40"/>
+        <w:spacing w:after="40" w:before="0"/>
       </w:pPr>
     </w:p>
     <w:sectPr>

</xml_diff>

<commit_message>
Update CV summary, leadership, Mayo work, and metrics
</commit_message>
<xml_diff>
--- a/Shahriarirad_Reza_CV.docx
+++ b/Shahriarirad_Reza_CV.docx
@@ -89,2039 +89,22 @@
           <w:color w:val="1F3864"/>
           <w:sz w:val="21"/>
         </w:rPr>
-        <w:t>PERSONAL INFORMATION</w:t>
-      </w:r>
-    </w:p>
-    <w:tbl>
-      <w:tblPr>
-        <w:tblStyle w:val="TableGrid"/>
-        <w:tblW w:type="auto" w:w="0"/>
-        <w:jc w:val="left"/>
-        <w:tblLayout w:type="autofit"/>
-        <w:tblLook w:firstColumn="1" w:firstRow="1" w:lastColumn="0" w:lastRow="0" w:noHBand="0" w:noVBand="1" w:val="04A0"/>
-      </w:tblPr>
-      <w:tblGrid>
-        <w:gridCol w:w="5184"/>
-        <w:gridCol w:w="5184"/>
-      </w:tblGrid>
-      <w:tr>
-        <w:tc>
-          <w:tcPr>
-            <w:tcW w:type="dxa" w:w="2664"/>
-            <w:vAlign w:val="center"/>
-          </w:tcPr>
-          <w:p>
-            <w:pPr>
-              <w:spacing w:after="0"/>
-            </w:pPr>
-            <w:r/>
-            <w:r>
-              <w:rPr>
-                <w:rFonts w:ascii="Arial" w:hAnsi="Arial" w:eastAsia="Arial"/>
-                <w:b w:val="0"/>
-                <w:i w:val="0"/>
-                <w:sz w:val="17"/>
-              </w:rPr>
-              <w:t>Surname</w:t>
-            </w:r>
-          </w:p>
-        </w:tc>
-        <w:tc>
-          <w:tcPr>
-            <w:tcW w:type="dxa" w:w="6840"/>
-            <w:vAlign w:val="center"/>
-          </w:tcPr>
-          <w:p>
-            <w:pPr>
-              <w:spacing w:after="0"/>
-            </w:pPr>
-            <w:r/>
-            <w:r>
-              <w:rPr>
-                <w:rFonts w:ascii="Arial" w:hAnsi="Arial" w:eastAsia="Arial"/>
-                <w:b w:val="0"/>
-                <w:i w:val="0"/>
-                <w:sz w:val="17"/>
-              </w:rPr>
-              <w:t>Shahriarirad</w:t>
-            </w:r>
-          </w:p>
-        </w:tc>
-      </w:tr>
-      <w:tr>
-        <w:tc>
-          <w:tcPr>
-            <w:tcW w:type="dxa" w:w="2664"/>
-            <w:vAlign w:val="center"/>
-          </w:tcPr>
-          <w:p>
-            <w:pPr>
-              <w:spacing w:after="0"/>
-            </w:pPr>
-            <w:r/>
-            <w:r>
-              <w:rPr>
-                <w:rFonts w:ascii="Arial" w:hAnsi="Arial" w:eastAsia="Arial"/>
-                <w:b w:val="0"/>
-                <w:i w:val="0"/>
-                <w:sz w:val="17"/>
-              </w:rPr>
-              <w:t>Given name</w:t>
-            </w:r>
-          </w:p>
-        </w:tc>
-        <w:tc>
-          <w:tcPr>
-            <w:tcW w:type="dxa" w:w="6840"/>
-            <w:vAlign w:val="center"/>
-          </w:tcPr>
-          <w:p>
-            <w:pPr>
-              <w:spacing w:after="0"/>
-            </w:pPr>
-            <w:r/>
-            <w:r>
-              <w:rPr>
-                <w:rFonts w:ascii="Arial" w:hAnsi="Arial" w:eastAsia="Arial"/>
-                <w:b w:val="0"/>
-                <w:i w:val="0"/>
-                <w:sz w:val="17"/>
-              </w:rPr>
-              <w:t>Reza</w:t>
-            </w:r>
-          </w:p>
-        </w:tc>
-      </w:tr>
-      <w:tr>
-        <w:tc>
-          <w:tcPr>
-            <w:tcW w:type="dxa" w:w="2664"/>
-            <w:vAlign w:val="center"/>
-          </w:tcPr>
-          <w:p>
-            <w:pPr>
-              <w:spacing w:after="0"/>
-            </w:pPr>
-            <w:r/>
-            <w:r>
-              <w:rPr>
-                <w:rFonts w:ascii="Arial" w:hAnsi="Arial" w:eastAsia="Arial"/>
-                <w:b w:val="0"/>
-                <w:i w:val="0"/>
-                <w:sz w:val="17"/>
-              </w:rPr>
-              <w:t>Current residence</w:t>
-            </w:r>
-          </w:p>
-        </w:tc>
-        <w:tc>
-          <w:tcPr>
-            <w:tcW w:type="dxa" w:w="6840"/>
-            <w:vAlign w:val="center"/>
-          </w:tcPr>
-          <w:p>
-            <w:pPr>
-              <w:spacing w:after="0"/>
-            </w:pPr>
-            <w:r/>
-            <w:r>
-              <w:rPr>
-                <w:rFonts w:ascii="Arial" w:hAnsi="Arial" w:eastAsia="Arial"/>
-                <w:b w:val="0"/>
-                <w:i w:val="0"/>
-                <w:sz w:val="17"/>
-              </w:rPr>
-              <w:t>Rochester, MN, USA</w:t>
-            </w:r>
-          </w:p>
-        </w:tc>
-      </w:tr>
-      <w:tr>
-        <w:tc>
-          <w:tcPr>
-            <w:tcW w:type="dxa" w:w="2664"/>
-            <w:vAlign w:val="center"/>
-          </w:tcPr>
-          <w:p>
-            <w:pPr>
-              <w:spacing w:after="0"/>
-            </w:pPr>
-            <w:r/>
-            <w:r>
-              <w:rPr>
-                <w:rFonts w:ascii="Arial" w:hAnsi="Arial" w:eastAsia="Arial"/>
-                <w:b w:val="0"/>
-                <w:i w:val="0"/>
-                <w:sz w:val="17"/>
-              </w:rPr>
-              <w:t>Date of writing CV</w:t>
-            </w:r>
-          </w:p>
-        </w:tc>
-        <w:tc>
-          <w:tcPr>
-            <w:tcW w:type="dxa" w:w="6840"/>
-            <w:vAlign w:val="center"/>
-          </w:tcPr>
-          <w:p>
-            <w:pPr>
-              <w:spacing w:after="0"/>
-            </w:pPr>
-            <w:r/>
-            <w:r>
-              <w:rPr>
-                <w:rFonts w:ascii="Arial" w:hAnsi="Arial" w:eastAsia="Arial"/>
-                <w:b w:val="0"/>
-                <w:i w:val="0"/>
-                <w:sz w:val="17"/>
-              </w:rPr>
-              <w:t>May 25, 2026</w:t>
-            </w:r>
-          </w:p>
-        </w:tc>
-      </w:tr>
-      <w:tr>
-        <w:tc>
-          <w:tcPr>
-            <w:tcW w:type="dxa" w:w="2664"/>
-            <w:vAlign w:val="center"/>
-          </w:tcPr>
-          <w:p>
-            <w:pPr>
-              <w:spacing w:after="0"/>
-            </w:pPr>
-            <w:r/>
-            <w:r>
-              <w:rPr>
-                <w:rFonts w:ascii="Arial" w:hAnsi="Arial" w:eastAsia="Arial"/>
-                <w:b w:val="0"/>
-                <w:i w:val="0"/>
-                <w:sz w:val="17"/>
-              </w:rPr>
-              <w:t>Verified reviews / peer reviews</w:t>
-            </w:r>
-          </w:p>
-        </w:tc>
-        <w:tc>
-          <w:tcPr>
-            <w:tcW w:type="dxa" w:w="6840"/>
-            <w:vAlign w:val="center"/>
-          </w:tcPr>
-          <w:p>
-            <w:pPr>
-              <w:spacing w:after="0"/>
-            </w:pPr>
-            <w:r/>
-            <w:r>
-              <w:rPr>
-                <w:rFonts w:ascii="Arial" w:hAnsi="Arial" w:eastAsia="Arial"/>
-                <w:b w:val="0"/>
-                <w:i w:val="0"/>
-                <w:sz w:val="17"/>
-              </w:rPr>
-              <w:t>149</w:t>
-            </w:r>
-          </w:p>
-        </w:tc>
-      </w:tr>
-      <w:tr>
-        <w:tc>
-          <w:tcPr>
-            <w:tcW w:type="dxa" w:w="2664"/>
-            <w:vAlign w:val="center"/>
-          </w:tcPr>
-          <w:p>
-            <w:pPr>
-              <w:spacing w:after="0"/>
-            </w:pPr>
-            <w:r/>
-            <w:r>
-              <w:rPr>
-                <w:rFonts w:ascii="Arial" w:hAnsi="Arial" w:eastAsia="Arial"/>
-                <w:b w:val="0"/>
-                <w:i w:val="0"/>
-                <w:sz w:val="17"/>
-              </w:rPr>
-              <w:t>Total citations</w:t>
-            </w:r>
-          </w:p>
-        </w:tc>
-        <w:tc>
-          <w:tcPr>
-            <w:tcW w:type="dxa" w:w="6840"/>
-            <w:vAlign w:val="center"/>
-          </w:tcPr>
-          <w:p>
-            <w:pPr>
-              <w:spacing w:after="0"/>
-            </w:pPr>
-            <w:r/>
-            <w:r>
-              <w:rPr>
-                <w:rFonts w:ascii="Arial" w:hAnsi="Arial" w:eastAsia="Arial"/>
-                <w:b w:val="0"/>
-                <w:i w:val="0"/>
-                <w:sz w:val="17"/>
-              </w:rPr>
-              <w:t>3425</w:t>
-            </w:r>
-          </w:p>
-        </w:tc>
-      </w:tr>
-      <w:tr>
-        <w:tc>
-          <w:tcPr>
-            <w:tcW w:type="dxa" w:w="2664"/>
-            <w:vAlign w:val="center"/>
-          </w:tcPr>
-          <w:p>
-            <w:pPr>
-              <w:spacing w:after="0"/>
-            </w:pPr>
-            <w:r/>
-            <w:r>
-              <w:rPr>
-                <w:rFonts w:ascii="Arial" w:hAnsi="Arial" w:eastAsia="Arial"/>
-                <w:b w:val="0"/>
-                <w:i w:val="0"/>
-                <w:sz w:val="17"/>
-              </w:rPr>
-              <w:t>H-index</w:t>
-            </w:r>
-          </w:p>
-        </w:tc>
-        <w:tc>
-          <w:tcPr>
-            <w:tcW w:type="dxa" w:w="6840"/>
-            <w:vAlign w:val="center"/>
-          </w:tcPr>
-          <w:p>
-            <w:pPr>
-              <w:spacing w:after="0"/>
-            </w:pPr>
-            <w:r/>
-            <w:r>
-              <w:rPr>
-                <w:rFonts w:ascii="Arial" w:hAnsi="Arial" w:eastAsia="Arial"/>
-                <w:b w:val="0"/>
-                <w:i w:val="0"/>
-                <w:sz w:val="17"/>
-              </w:rPr>
-              <w:t>24</w:t>
-            </w:r>
-          </w:p>
-        </w:tc>
-      </w:tr>
-      <w:tr>
-        <w:tc>
-          <w:tcPr>
-            <w:tcW w:type="dxa" w:w="2664"/>
-            <w:vAlign w:val="center"/>
-          </w:tcPr>
-          <w:p>
-            <w:pPr>
-              <w:spacing w:after="0"/>
-            </w:pPr>
-            <w:r/>
-            <w:r>
-              <w:rPr>
-                <w:rFonts w:ascii="Arial" w:hAnsi="Arial" w:eastAsia="Arial"/>
-                <w:b w:val="0"/>
-                <w:i w:val="0"/>
-                <w:sz w:val="17"/>
-              </w:rPr>
-              <w:t>Research interests</w:t>
-            </w:r>
-          </w:p>
-        </w:tc>
-        <w:tc>
-          <w:tcPr>
-            <w:tcW w:type="dxa" w:w="6840"/>
-            <w:vAlign w:val="center"/>
-          </w:tcPr>
-          <w:p>
-            <w:pPr>
-              <w:spacing w:after="0"/>
-            </w:pPr>
-            <w:r/>
-            <w:r>
-              <w:rPr>
-                <w:rFonts w:ascii="Arial" w:hAnsi="Arial" w:eastAsia="Arial"/>
-                <w:b w:val="0"/>
-                <w:i w:val="0"/>
-                <w:sz w:val="17"/>
-              </w:rPr>
-              <w:t>Surgery · Minimally Invasive Surgery · Artificial Intelligence</w:t>
-            </w:r>
-          </w:p>
-        </w:tc>
-      </w:tr>
-    </w:tbl>
-    <w:p>
-      <w:pPr>
-        <w:spacing w:after="40" w:before="0"/>
-      </w:pPr>
+        <w:t>RESEARCH SUMMARY</w:t>
+      </w:r>
     </w:p>
     <w:p>
       <w:pPr>
-        <w:spacing w:before="180" w:after="60"/>
-        <w:pBdr>
-          <w:bottom w:val="single" w:sz="6" w:space="1" w:color="B8953A"/>
-        </w:pBdr>
+        <w:spacing w:after="80" w:before="0"/>
       </w:pPr>
       <w:r>
         <w:rPr>
           <w:rFonts w:ascii="Arial" w:hAnsi="Arial" w:eastAsia="Arial"/>
-          <w:b/>
-          <w:i w:val="0"/>
-          <w:color w:val="1F3864"/>
-          <w:sz w:val="21"/>
-        </w:rPr>
-        <w:t>EDUCATION</w:t>
-      </w:r>
-    </w:p>
-    <w:tbl>
-      <w:tblPr>
-        <w:tblStyle w:val="TableGrid"/>
-        <w:tblW w:type="auto" w:w="0"/>
-        <w:jc w:val="left"/>
-        <w:tblLayout w:type="autofit"/>
-        <w:tblLook w:firstColumn="1" w:firstRow="1" w:lastColumn="0" w:lastRow="0" w:noHBand="0" w:noVBand="1" w:val="04A0"/>
-      </w:tblPr>
-      <w:tblGrid>
-        <w:gridCol w:w="2592"/>
-        <w:gridCol w:w="2592"/>
-        <w:gridCol w:w="2592"/>
-        <w:gridCol w:w="2592"/>
-      </w:tblGrid>
-      <w:tr>
-        <w:tc>
-          <w:tcPr>
-            <w:tcW w:type="dxa" w:w="2592"/>
-            <w:vAlign w:val="center"/>
-            <w:shd w:fill="D9EAF7"/>
-          </w:tcPr>
-          <w:p>
-            <w:pPr>
-              <w:spacing w:after="0"/>
-            </w:pPr>
-            <w:r/>
-            <w:r>
-              <w:rPr>
-                <w:rFonts w:ascii="Arial" w:hAnsi="Arial" w:eastAsia="Arial"/>
-                <w:b/>
-                <w:i w:val="0"/>
-                <w:color w:val="1F3864"/>
-                <w:sz w:val="17"/>
-              </w:rPr>
-              <w:t>Period</w:t>
-            </w:r>
-          </w:p>
-        </w:tc>
-        <w:tc>
-          <w:tcPr>
-            <w:tcW w:type="dxa" w:w="2592"/>
-            <w:vAlign w:val="center"/>
-            <w:shd w:fill="D9EAF7"/>
-          </w:tcPr>
-          <w:p>
-            <w:pPr>
-              <w:spacing w:after="0"/>
-            </w:pPr>
-            <w:r/>
-            <w:r>
-              <w:rPr>
-                <w:rFonts w:ascii="Arial" w:hAnsi="Arial" w:eastAsia="Arial"/>
-                <w:b/>
-                <w:i w:val="0"/>
-                <w:color w:val="1F3864"/>
-                <w:sz w:val="17"/>
-              </w:rPr>
-              <w:t>Degree</w:t>
-            </w:r>
-          </w:p>
-        </w:tc>
-        <w:tc>
-          <w:tcPr>
-            <w:tcW w:type="dxa" w:w="2592"/>
-            <w:vAlign w:val="center"/>
-            <w:shd w:fill="D9EAF7"/>
-          </w:tcPr>
-          <w:p>
-            <w:pPr>
-              <w:spacing w:after="0"/>
-            </w:pPr>
-            <w:r/>
-            <w:r>
-              <w:rPr>
-                <w:rFonts w:ascii="Arial" w:hAnsi="Arial" w:eastAsia="Arial"/>
-                <w:b/>
-                <w:i w:val="0"/>
-                <w:color w:val="1F3864"/>
-                <w:sz w:val="17"/>
-              </w:rPr>
-              <w:t>Institution</w:t>
-            </w:r>
-          </w:p>
-        </w:tc>
-        <w:tc>
-          <w:tcPr>
-            <w:tcW w:type="dxa" w:w="2592"/>
-            <w:vAlign w:val="center"/>
-            <w:shd w:fill="D9EAF7"/>
-          </w:tcPr>
-          <w:p>
-            <w:pPr>
-              <w:spacing w:after="0"/>
-            </w:pPr>
-            <w:r/>
-            <w:r>
-              <w:rPr>
-                <w:rFonts w:ascii="Arial" w:hAnsi="Arial" w:eastAsia="Arial"/>
-                <w:b/>
-                <w:i w:val="0"/>
-                <w:color w:val="1F3864"/>
-                <w:sz w:val="17"/>
-              </w:rPr>
-              <w:t>Location</w:t>
-            </w:r>
-          </w:p>
-        </w:tc>
-      </w:tr>
-      <w:tr>
-        <w:tc>
-          <w:tcPr>
-            <w:tcW w:type="dxa" w:w="2592"/>
-            <w:vAlign w:val="center"/>
-          </w:tcPr>
-          <w:p>
-            <w:pPr>
-              <w:spacing w:after="0"/>
-            </w:pPr>
-            <w:r/>
-            <w:r>
-              <w:rPr>
-                <w:rFonts w:ascii="Arial" w:hAnsi="Arial" w:eastAsia="Arial"/>
-                <w:b w:val="0"/>
-                <w:i w:val="0"/>
-                <w:sz w:val="17"/>
-              </w:rPr>
-              <w:t>2013 – 2020</w:t>
-            </w:r>
-          </w:p>
-        </w:tc>
-        <w:tc>
-          <w:tcPr>
-            <w:tcW w:type="dxa" w:w="2592"/>
-            <w:vAlign w:val="center"/>
-          </w:tcPr>
-          <w:p>
-            <w:pPr>
-              <w:spacing w:after="0"/>
-            </w:pPr>
-            <w:r/>
-            <w:r>
-              <w:rPr>
-                <w:rFonts w:ascii="Arial" w:hAnsi="Arial" w:eastAsia="Arial"/>
-                <w:b w:val="0"/>
-                <w:i w:val="0"/>
-                <w:sz w:val="17"/>
-              </w:rPr>
-              <w:t>Doctor of Medicine (M.D.)</w:t>
-            </w:r>
-          </w:p>
-        </w:tc>
-        <w:tc>
-          <w:tcPr>
-            <w:tcW w:type="dxa" w:w="2592"/>
-            <w:vAlign w:val="center"/>
-          </w:tcPr>
-          <w:p>
-            <w:pPr>
-              <w:spacing w:after="0"/>
-            </w:pPr>
-            <w:r/>
-            <w:r>
-              <w:rPr>
-                <w:rFonts w:ascii="Arial" w:hAnsi="Arial" w:eastAsia="Arial"/>
-                <w:b w:val="0"/>
-                <w:i w:val="0"/>
-                <w:sz w:val="17"/>
-              </w:rPr>
-              <w:t>Shiraz University of Medical Sciences · Shiraz, Iran (SUMS)</w:t>
-            </w:r>
-          </w:p>
-        </w:tc>
-        <w:tc>
-          <w:tcPr>
-            <w:tcW w:type="dxa" w:w="2592"/>
-            <w:vAlign w:val="center"/>
-          </w:tcPr>
-          <w:p>
-            <w:pPr>
-              <w:spacing w:after="0"/>
-            </w:pPr>
-            <w:r/>
-            <w:r>
-              <w:rPr>
-                <w:rFonts w:ascii="Arial" w:hAnsi="Arial" w:eastAsia="Arial"/>
-                <w:b w:val="0"/>
-                <w:i w:val="0"/>
-                <w:sz w:val="17"/>
-              </w:rPr>
-              <w:t>Shiraz, Iran</w:t>
-            </w:r>
-          </w:p>
-        </w:tc>
-      </w:tr>
-      <w:tr>
-        <w:tc>
-          <w:tcPr>
-            <w:tcW w:type="dxa" w:w="2592"/>
-            <w:vAlign w:val="center"/>
-          </w:tcPr>
-          <w:p>
-            <w:pPr>
-              <w:spacing w:after="0"/>
-            </w:pPr>
-            <w:r/>
-            <w:r>
-              <w:rPr>
-                <w:rFonts w:ascii="Arial" w:hAnsi="Arial" w:eastAsia="Arial"/>
-                <w:b w:val="0"/>
-                <w:i w:val="0"/>
-                <w:sz w:val="17"/>
-              </w:rPr>
-              <w:t>2009 – 2013</w:t>
-            </w:r>
-          </w:p>
-        </w:tc>
-        <w:tc>
-          <w:tcPr>
-            <w:tcW w:type="dxa" w:w="2592"/>
-            <w:vAlign w:val="center"/>
-          </w:tcPr>
-          <w:p>
-            <w:pPr>
-              <w:spacing w:after="0"/>
-            </w:pPr>
-            <w:r/>
-            <w:r>
-              <w:rPr>
-                <w:rFonts w:ascii="Arial" w:hAnsi="Arial" w:eastAsia="Arial"/>
-                <w:b w:val="0"/>
-                <w:i w:val="0"/>
-                <w:sz w:val="17"/>
-              </w:rPr>
-              <w:t>High School Diploma</w:t>
-            </w:r>
-          </w:p>
-        </w:tc>
-        <w:tc>
-          <w:tcPr>
-            <w:tcW w:type="dxa" w:w="2592"/>
-            <w:vAlign w:val="center"/>
-          </w:tcPr>
-          <w:p>
-            <w:pPr>
-              <w:spacing w:after="0"/>
-            </w:pPr>
-            <w:r/>
-            <w:r>
-              <w:rPr>
-                <w:rFonts w:ascii="Arial" w:hAnsi="Arial" w:eastAsia="Arial"/>
-                <w:b w:val="0"/>
-                <w:i w:val="0"/>
-                <w:sz w:val="17"/>
-              </w:rPr>
-              <w:t>National Organization for Development of Exceptional Talents (SAMPAD)</w:t>
-            </w:r>
-          </w:p>
-        </w:tc>
-        <w:tc>
-          <w:tcPr>
-            <w:tcW w:type="dxa" w:w="2592"/>
-            <w:vAlign w:val="center"/>
-          </w:tcPr>
-          <w:p>
-            <w:pPr>
-              <w:spacing w:after="0"/>
-            </w:pPr>
-            <w:r/>
-            <w:r>
-              <w:rPr>
-                <w:rFonts w:ascii="Arial" w:hAnsi="Arial" w:eastAsia="Arial"/>
-                <w:b w:val="0"/>
-                <w:i w:val="0"/>
-                <w:sz w:val="17"/>
-              </w:rPr>
-              <w:t>Shiraz, Iran</w:t>
-            </w:r>
-          </w:p>
-        </w:tc>
-      </w:tr>
-    </w:tbl>
-    <w:p>
-      <w:pPr>
-        <w:spacing w:after="40" w:before="0"/>
-      </w:pPr>
-    </w:p>
-    <w:p>
-      <w:pPr>
-        <w:spacing w:before="180" w:after="60"/>
-        <w:pBdr>
-          <w:bottom w:val="single" w:sz="6" w:space="1" w:color="B8953A"/>
-        </w:pBdr>
-      </w:pPr>
-      <w:r>
-        <w:rPr>
-          <w:rFonts w:ascii="Arial" w:hAnsi="Arial" w:eastAsia="Arial"/>
-          <w:b/>
-          <w:i w:val="0"/>
-          <w:color w:val="1F3864"/>
-          <w:sz w:val="21"/>
-        </w:rPr>
-        <w:t>WORKING AND PROFESSIONAL EXPERIENCE</w:t>
-      </w:r>
-    </w:p>
-    <w:tbl>
-      <w:tblPr>
-        <w:tblStyle w:val="TableGrid"/>
-        <w:tblW w:type="auto" w:w="0"/>
-        <w:jc w:val="left"/>
-        <w:tblLayout w:type="autofit"/>
-        <w:tblLook w:firstColumn="1" w:firstRow="1" w:lastColumn="0" w:lastRow="0" w:noHBand="0" w:noVBand="1" w:val="04A0"/>
-      </w:tblPr>
-      <w:tblGrid>
-        <w:gridCol w:w="2592"/>
-        <w:gridCol w:w="2592"/>
-        <w:gridCol w:w="2592"/>
-        <w:gridCol w:w="2592"/>
-      </w:tblGrid>
-      <w:tr>
-        <w:tc>
-          <w:tcPr>
-            <w:tcW w:type="dxa" w:w="2592"/>
-            <w:vAlign w:val="center"/>
-            <w:shd w:fill="D9EAF7"/>
-          </w:tcPr>
-          <w:p>
-            <w:pPr>
-              <w:spacing w:after="0"/>
-            </w:pPr>
-            <w:r/>
-            <w:r>
-              <w:rPr>
-                <w:rFonts w:ascii="Arial" w:hAnsi="Arial" w:eastAsia="Arial"/>
-                <w:b/>
-                <w:i w:val="0"/>
-                <w:color w:val="1F3864"/>
-                <w:sz w:val="17"/>
-              </w:rPr>
-              <w:t>Period</w:t>
-            </w:r>
-          </w:p>
-        </w:tc>
-        <w:tc>
-          <w:tcPr>
-            <w:tcW w:type="dxa" w:w="2592"/>
-            <w:vAlign w:val="center"/>
-            <w:shd w:fill="D9EAF7"/>
-          </w:tcPr>
-          <w:p>
-            <w:pPr>
-              <w:spacing w:after="0"/>
-            </w:pPr>
-            <w:r/>
-            <w:r>
-              <w:rPr>
-                <w:rFonts w:ascii="Arial" w:hAnsi="Arial" w:eastAsia="Arial"/>
-                <w:b/>
-                <w:i w:val="0"/>
-                <w:color w:val="1F3864"/>
-                <w:sz w:val="17"/>
-              </w:rPr>
-              <w:t>Role / organization</w:t>
-            </w:r>
-          </w:p>
-        </w:tc>
-        <w:tc>
-          <w:tcPr>
-            <w:tcW w:type="dxa" w:w="2592"/>
-            <w:vAlign w:val="center"/>
-            <w:shd w:fill="D9EAF7"/>
-          </w:tcPr>
-          <w:p>
-            <w:pPr>
-              <w:spacing w:after="0"/>
-            </w:pPr>
-            <w:r/>
-            <w:r>
-              <w:rPr>
-                <w:rFonts w:ascii="Arial" w:hAnsi="Arial" w:eastAsia="Arial"/>
-                <w:b/>
-                <w:i w:val="0"/>
-                <w:color w:val="1F3864"/>
-                <w:sz w:val="17"/>
-              </w:rPr>
-              <w:t>Location</w:t>
-            </w:r>
-          </w:p>
-        </w:tc>
-        <w:tc>
-          <w:tcPr>
-            <w:tcW w:type="dxa" w:w="2592"/>
-            <w:vAlign w:val="center"/>
-            <w:shd w:fill="D9EAF7"/>
-          </w:tcPr>
-          <w:p>
-            <w:pPr>
-              <w:spacing w:after="0"/>
-            </w:pPr>
-            <w:r/>
-            <w:r>
-              <w:rPr>
-                <w:rFonts w:ascii="Arial" w:hAnsi="Arial" w:eastAsia="Arial"/>
-                <w:b/>
-                <w:i w:val="0"/>
-                <w:color w:val="1F3864"/>
-                <w:sz w:val="17"/>
-              </w:rPr>
-              <w:t>Description</w:t>
-            </w:r>
-          </w:p>
-        </w:tc>
-      </w:tr>
-      <w:tr>
-        <w:tc>
-          <w:tcPr>
-            <w:tcW w:type="dxa" w:w="2592"/>
-            <w:vAlign w:val="center"/>
-          </w:tcPr>
-          <w:p>
-            <w:pPr>
-              <w:spacing w:after="0"/>
-            </w:pPr>
-            <w:r/>
-            <w:r>
-              <w:rPr>
-                <w:rFonts w:ascii="Arial" w:hAnsi="Arial" w:eastAsia="Arial"/>
-                <w:b w:val="0"/>
-                <w:i w:val="0"/>
-                <w:sz w:val="17"/>
-              </w:rPr>
-              <w:t>2024 – Present</w:t>
-            </w:r>
-          </w:p>
-        </w:tc>
-        <w:tc>
-          <w:tcPr>
-            <w:tcW w:type="dxa" w:w="2592"/>
-            <w:vAlign w:val="center"/>
-          </w:tcPr>
-          <w:p>
-            <w:pPr>
-              <w:spacing w:after="0"/>
-            </w:pPr>
-            <w:r/>
-            <w:r>
-              <w:rPr>
-                <w:rFonts w:ascii="Arial" w:hAnsi="Arial" w:eastAsia="Arial"/>
-                <w:b w:val="0"/>
-                <w:i w:val="0"/>
-                <w:sz w:val="17"/>
-              </w:rPr>
-              <w:t>Research Fellow | Surgery Innovation Center · Mayo Clinic</w:t>
-            </w:r>
-          </w:p>
-        </w:tc>
-        <w:tc>
-          <w:tcPr>
-            <w:tcW w:type="dxa" w:w="2592"/>
-            <w:vAlign w:val="center"/>
-          </w:tcPr>
-          <w:p>
-            <w:pPr>
-              <w:spacing w:after="0"/>
-            </w:pPr>
-            <w:r/>
-            <w:r>
-              <w:rPr>
-                <w:rFonts w:ascii="Arial" w:hAnsi="Arial" w:eastAsia="Arial"/>
-                <w:b w:val="0"/>
-                <w:i w:val="0"/>
-                <w:sz w:val="17"/>
-              </w:rPr>
-              <w:t>Rochester, MN</w:t>
-            </w:r>
-          </w:p>
-        </w:tc>
-        <w:tc>
-          <w:tcPr>
-            <w:tcW w:type="dxa" w:w="2592"/>
-            <w:vAlign w:val="center"/>
-          </w:tcPr>
-          <w:p>
-            <w:pPr>
-              <w:spacing w:after="0"/>
-            </w:pPr>
-            <w:r/>
-            <w:r>
-              <w:rPr>
-                <w:rFonts w:ascii="Arial" w:hAnsi="Arial" w:eastAsia="Arial"/>
-                <w:b w:val="0"/>
-                <w:i w:val="0"/>
-                <w:sz w:val="17"/>
-              </w:rPr>
-            </w:r>
-          </w:p>
-        </w:tc>
-      </w:tr>
-      <w:tr>
-        <w:tc>
-          <w:tcPr>
-            <w:tcW w:type="dxa" w:w="2592"/>
-            <w:vAlign w:val="center"/>
-          </w:tcPr>
-          <w:p>
-            <w:pPr>
-              <w:spacing w:after="0"/>
-            </w:pPr>
-            <w:r/>
-            <w:r>
-              <w:rPr>
-                <w:rFonts w:ascii="Arial" w:hAnsi="Arial" w:eastAsia="Arial"/>
-                <w:b w:val="0"/>
-                <w:i w:val="0"/>
-                <w:sz w:val="17"/>
-              </w:rPr>
-              <w:t>2018 – 2024</w:t>
-            </w:r>
-          </w:p>
-        </w:tc>
-        <w:tc>
-          <w:tcPr>
-            <w:tcW w:type="dxa" w:w="2592"/>
-            <w:vAlign w:val="center"/>
-          </w:tcPr>
-          <w:p>
-            <w:pPr>
-              <w:spacing w:after="0"/>
-            </w:pPr>
-            <w:r/>
-            <w:r>
-              <w:rPr>
-                <w:rFonts w:ascii="Arial" w:hAnsi="Arial" w:eastAsia="Arial"/>
-                <w:b w:val="0"/>
-                <w:i w:val="0"/>
-                <w:sz w:val="17"/>
-              </w:rPr>
-              <w:t>Senior Researcher &amp; Project Manager | Thoracic &amp; Vascular Surgery Research Center · Shiraz University of Medical Sciences</w:t>
-            </w:r>
-          </w:p>
-        </w:tc>
-        <w:tc>
-          <w:tcPr>
-            <w:tcW w:type="dxa" w:w="2592"/>
-            <w:vAlign w:val="center"/>
-          </w:tcPr>
-          <w:p>
-            <w:pPr>
-              <w:spacing w:after="0"/>
-            </w:pPr>
-            <w:r/>
-            <w:r>
-              <w:rPr>
-                <w:rFonts w:ascii="Arial" w:hAnsi="Arial" w:eastAsia="Arial"/>
-                <w:b w:val="0"/>
-                <w:i w:val="0"/>
-                <w:sz w:val="17"/>
-              </w:rPr>
-              <w:t>Shiraz, Iran</w:t>
-            </w:r>
-          </w:p>
-        </w:tc>
-        <w:tc>
-          <w:tcPr>
-            <w:tcW w:type="dxa" w:w="2592"/>
-            <w:vAlign w:val="center"/>
-          </w:tcPr>
-          <w:p>
-            <w:pPr>
-              <w:spacing w:after="0"/>
-            </w:pPr>
-            <w:r/>
-            <w:r>
-              <w:rPr>
-                <w:rFonts w:ascii="Arial" w:hAnsi="Arial" w:eastAsia="Arial"/>
-                <w:b w:val="0"/>
-                <w:i w:val="0"/>
-                <w:sz w:val="17"/>
-              </w:rPr>
-            </w:r>
-          </w:p>
-        </w:tc>
-      </w:tr>
-      <w:tr>
-        <w:tc>
-          <w:tcPr>
-            <w:tcW w:type="dxa" w:w="2592"/>
-            <w:vAlign w:val="center"/>
-          </w:tcPr>
-          <w:p>
-            <w:pPr>
-              <w:spacing w:after="0"/>
-            </w:pPr>
-            <w:r/>
-            <w:r>
-              <w:rPr>
-                <w:rFonts w:ascii="Arial" w:hAnsi="Arial" w:eastAsia="Arial"/>
-                <w:b w:val="0"/>
-                <w:i w:val="0"/>
-                <w:sz w:val="17"/>
-              </w:rPr>
-              <w:t>2020 – 2022</w:t>
-            </w:r>
-          </w:p>
-        </w:tc>
-        <w:tc>
-          <w:tcPr>
-            <w:tcW w:type="dxa" w:w="2592"/>
-            <w:vAlign w:val="center"/>
-          </w:tcPr>
-          <w:p>
-            <w:pPr>
-              <w:spacing w:after="0"/>
-            </w:pPr>
-            <w:r/>
-            <w:r>
-              <w:rPr>
-                <w:rFonts w:ascii="Arial" w:hAnsi="Arial" w:eastAsia="Arial"/>
-                <w:b w:val="0"/>
-                <w:i w:val="0"/>
-                <w:sz w:val="17"/>
-              </w:rPr>
-              <w:t>General Practitioner — Emergency Department | Khatam-al-Anbiya Hospital</w:t>
-            </w:r>
-          </w:p>
-        </w:tc>
-        <w:tc>
-          <w:tcPr>
-            <w:tcW w:type="dxa" w:w="2592"/>
-            <w:vAlign w:val="center"/>
-          </w:tcPr>
-          <w:p>
-            <w:pPr>
-              <w:spacing w:after="0"/>
-            </w:pPr>
-            <w:r/>
-            <w:r>
-              <w:rPr>
-                <w:rFonts w:ascii="Arial" w:hAnsi="Arial" w:eastAsia="Arial"/>
-                <w:b w:val="0"/>
-                <w:i w:val="0"/>
-                <w:sz w:val="17"/>
-              </w:rPr>
-              <w:t>Bushehr, Iran</w:t>
-            </w:r>
-          </w:p>
-        </w:tc>
-        <w:tc>
-          <w:tcPr>
-            <w:tcW w:type="dxa" w:w="2592"/>
-            <w:vAlign w:val="center"/>
-          </w:tcPr>
-          <w:p>
-            <w:pPr>
-              <w:spacing w:after="0"/>
-            </w:pPr>
-            <w:r/>
-            <w:r>
-              <w:rPr>
-                <w:rFonts w:ascii="Arial" w:hAnsi="Arial" w:eastAsia="Arial"/>
-                <w:b w:val="0"/>
-                <w:i w:val="0"/>
-                <w:sz w:val="17"/>
-              </w:rPr>
-              <w:t>Ministry of Health mandatory medical service.</w:t>
-            </w:r>
-          </w:p>
-        </w:tc>
-      </w:tr>
-      <w:tr>
-        <w:tc>
-          <w:tcPr>
-            <w:tcW w:type="dxa" w:w="2592"/>
-            <w:vAlign w:val="center"/>
-          </w:tcPr>
-          <w:p>
-            <w:pPr>
-              <w:spacing w:after="0"/>
-            </w:pPr>
-            <w:r/>
-            <w:r>
-              <w:rPr>
-                <w:rFonts w:ascii="Arial" w:hAnsi="Arial" w:eastAsia="Arial"/>
-                <w:b w:val="0"/>
-                <w:i w:val="0"/>
-                <w:sz w:val="17"/>
-              </w:rPr>
-              <w:t>2014 – 2020</w:t>
-            </w:r>
-          </w:p>
-        </w:tc>
-        <w:tc>
-          <w:tcPr>
-            <w:tcW w:type="dxa" w:w="2592"/>
-            <w:vAlign w:val="center"/>
-          </w:tcPr>
-          <w:p>
-            <w:pPr>
-              <w:spacing w:after="0"/>
-            </w:pPr>
-            <w:r/>
-            <w:r>
-              <w:rPr>
-                <w:rFonts w:ascii="Arial" w:hAnsi="Arial" w:eastAsia="Arial"/>
-                <w:b w:val="0"/>
-                <w:i w:val="0"/>
-                <w:sz w:val="17"/>
-              </w:rPr>
-              <w:t>Research Trainee | Student Research Committee · Shiraz University of Medical Sciences</w:t>
-            </w:r>
-          </w:p>
-        </w:tc>
-        <w:tc>
-          <w:tcPr>
-            <w:tcW w:type="dxa" w:w="2592"/>
-            <w:vAlign w:val="center"/>
-          </w:tcPr>
-          <w:p>
-            <w:pPr>
-              <w:spacing w:after="0"/>
-            </w:pPr>
-            <w:r/>
-            <w:r>
-              <w:rPr>
-                <w:rFonts w:ascii="Arial" w:hAnsi="Arial" w:eastAsia="Arial"/>
-                <w:b w:val="0"/>
-                <w:i w:val="0"/>
-                <w:sz w:val="17"/>
-              </w:rPr>
-              <w:t>Shiraz, Iran</w:t>
-            </w:r>
-          </w:p>
-        </w:tc>
-        <w:tc>
-          <w:tcPr>
-            <w:tcW w:type="dxa" w:w="2592"/>
-            <w:vAlign w:val="center"/>
-          </w:tcPr>
-          <w:p>
-            <w:pPr>
-              <w:spacing w:after="0"/>
-            </w:pPr>
-            <w:r/>
-            <w:r>
-              <w:rPr>
-                <w:rFonts w:ascii="Arial" w:hAnsi="Arial" w:eastAsia="Arial"/>
-                <w:b w:val="0"/>
-                <w:i w:val="0"/>
-                <w:sz w:val="17"/>
-              </w:rPr>
-            </w:r>
-          </w:p>
-        </w:tc>
-      </w:tr>
-    </w:tbl>
-    <w:p>
-      <w:pPr>
-        <w:spacing w:after="40" w:before="0"/>
-      </w:pPr>
-    </w:p>
-    <w:p>
-      <w:pPr>
-        <w:spacing w:before="180" w:after="60"/>
-        <w:pBdr>
-          <w:bottom w:val="single" w:sz="6" w:space="1" w:color="B8953A"/>
-        </w:pBdr>
-      </w:pPr>
-      <w:r>
-        <w:rPr>
-          <w:rFonts w:ascii="Arial" w:hAnsi="Arial" w:eastAsia="Arial"/>
-          <w:b/>
-          <w:i w:val="0"/>
-          <w:color w:val="1F3864"/>
-          <w:sz w:val="21"/>
-        </w:rPr>
-        <w:t>AWARDS</w:t>
-      </w:r>
-    </w:p>
-    <w:tbl>
-      <w:tblPr>
-        <w:tblStyle w:val="TableGrid"/>
-        <w:tblW w:type="auto" w:w="0"/>
-        <w:jc w:val="left"/>
-        <w:tblLayout w:type="autofit"/>
-        <w:tblLook w:firstColumn="1" w:firstRow="1" w:lastColumn="0" w:lastRow="0" w:noHBand="0" w:noVBand="1" w:val="04A0"/>
-      </w:tblPr>
-      <w:tblGrid>
-        <w:gridCol w:w="3456"/>
-        <w:gridCol w:w="3456"/>
-        <w:gridCol w:w="3456"/>
-      </w:tblGrid>
-      <w:tr>
-        <w:tc>
-          <w:tcPr>
-            <w:tcW w:type="dxa" w:w="3456"/>
-            <w:vAlign w:val="center"/>
-            <w:shd w:fill="D9EAF7"/>
-          </w:tcPr>
-          <w:p>
-            <w:pPr>
-              <w:spacing w:after="0"/>
-            </w:pPr>
-            <w:r/>
-            <w:r>
-              <w:rPr>
-                <w:rFonts w:ascii="Arial" w:hAnsi="Arial" w:eastAsia="Arial"/>
-                <w:b/>
-                <w:i w:val="0"/>
-                <w:color w:val="1F3864"/>
-                <w:sz w:val="17"/>
-              </w:rPr>
-              <w:t>Year</w:t>
-            </w:r>
-          </w:p>
-        </w:tc>
-        <w:tc>
-          <w:tcPr>
-            <w:tcW w:type="dxa" w:w="3456"/>
-            <w:vAlign w:val="center"/>
-            <w:shd w:fill="D9EAF7"/>
-          </w:tcPr>
-          <w:p>
-            <w:pPr>
-              <w:spacing w:after="0"/>
-            </w:pPr>
-            <w:r/>
-            <w:r>
-              <w:rPr>
-                <w:rFonts w:ascii="Arial" w:hAnsi="Arial" w:eastAsia="Arial"/>
-                <w:b/>
-                <w:i w:val="0"/>
-                <w:color w:val="1F3864"/>
-                <w:sz w:val="17"/>
-              </w:rPr>
-              <w:t>Award</w:t>
-            </w:r>
-          </w:p>
-        </w:tc>
-        <w:tc>
-          <w:tcPr>
-            <w:tcW w:type="dxa" w:w="3456"/>
-            <w:vAlign w:val="center"/>
-            <w:shd w:fill="D9EAF7"/>
-          </w:tcPr>
-          <w:p>
-            <w:pPr>
-              <w:spacing w:after="0"/>
-            </w:pPr>
-            <w:r/>
-            <w:r>
-              <w:rPr>
-                <w:rFonts w:ascii="Arial" w:hAnsi="Arial" w:eastAsia="Arial"/>
-                <w:b/>
-                <w:i w:val="0"/>
-                <w:color w:val="1F3864"/>
-                <w:sz w:val="17"/>
-              </w:rPr>
-              <w:t>Organization</w:t>
-            </w:r>
-          </w:p>
-        </w:tc>
-      </w:tr>
-      <w:tr>
-        <w:tc>
-          <w:tcPr>
-            <w:tcW w:type="dxa" w:w="3456"/>
-            <w:vAlign w:val="center"/>
-          </w:tcPr>
-          <w:p>
-            <w:pPr>
-              <w:spacing w:after="0"/>
-            </w:pPr>
-            <w:r/>
-            <w:r>
-              <w:rPr>
-                <w:rFonts w:ascii="Arial" w:hAnsi="Arial" w:eastAsia="Arial"/>
-                <w:b w:val="0"/>
-                <w:i w:val="0"/>
-                <w:sz w:val="17"/>
-              </w:rPr>
-              <w:t>December 2023</w:t>
-            </w:r>
-          </w:p>
-        </w:tc>
-        <w:tc>
-          <w:tcPr>
-            <w:tcW w:type="dxa" w:w="3456"/>
-            <w:vAlign w:val="center"/>
-          </w:tcPr>
-          <w:p>
-            <w:pPr>
-              <w:spacing w:after="0"/>
-            </w:pPr>
-            <w:r/>
-            <w:r>
-              <w:rPr>
-                <w:rFonts w:ascii="Arial" w:hAnsi="Arial" w:eastAsia="Arial"/>
-                <w:b w:val="0"/>
-                <w:i w:val="0"/>
-                <w:sz w:val="17"/>
-              </w:rPr>
-              <w:t>World Top 2% Scientists</w:t>
-            </w:r>
-          </w:p>
-        </w:tc>
-        <w:tc>
-          <w:tcPr>
-            <w:tcW w:type="dxa" w:w="3456"/>
-            <w:vAlign w:val="center"/>
-          </w:tcPr>
-          <w:p>
-            <w:pPr>
-              <w:spacing w:after="0"/>
-            </w:pPr>
-            <w:r/>
-            <w:r>
-              <w:rPr>
-                <w:rFonts w:ascii="Arial" w:hAnsi="Arial" w:eastAsia="Arial"/>
-                <w:b w:val="0"/>
-                <w:i w:val="0"/>
-                <w:sz w:val="17"/>
-              </w:rPr>
-              <w:t>Elsevier Data Repository / Stanford University</w:t>
-            </w:r>
-          </w:p>
-        </w:tc>
-      </w:tr>
-      <w:tr>
-        <w:tc>
-          <w:tcPr>
-            <w:tcW w:type="dxa" w:w="3456"/>
-            <w:vAlign w:val="center"/>
-          </w:tcPr>
-          <w:p>
-            <w:pPr>
-              <w:spacing w:after="0"/>
-            </w:pPr>
-            <w:r/>
-            <w:r>
-              <w:rPr>
-                <w:rFonts w:ascii="Arial" w:hAnsi="Arial" w:eastAsia="Arial"/>
-                <w:b w:val="0"/>
-                <w:i w:val="0"/>
-                <w:sz w:val="17"/>
-              </w:rPr>
-              <w:t>October 2020</w:t>
-            </w:r>
-          </w:p>
-        </w:tc>
-        <w:tc>
-          <w:tcPr>
-            <w:tcW w:type="dxa" w:w="3456"/>
-            <w:vAlign w:val="center"/>
-          </w:tcPr>
-          <w:p>
-            <w:pPr>
-              <w:spacing w:after="0"/>
-            </w:pPr>
-            <w:r/>
-            <w:r>
-              <w:rPr>
-                <w:rFonts w:ascii="Arial" w:hAnsi="Arial" w:eastAsia="Arial"/>
-                <w:b w:val="0"/>
-                <w:i w:val="0"/>
-                <w:sz w:val="17"/>
-              </w:rPr>
-              <w:t>National Outstanding Student Researcher</w:t>
-            </w:r>
-          </w:p>
-        </w:tc>
-        <w:tc>
-          <w:tcPr>
-            <w:tcW w:type="dxa" w:w="3456"/>
-            <w:vAlign w:val="center"/>
-          </w:tcPr>
-          <w:p>
-            <w:pPr>
-              <w:spacing w:after="0"/>
-            </w:pPr>
-            <w:r/>
-            <w:r>
-              <w:rPr>
-                <w:rFonts w:ascii="Arial" w:hAnsi="Arial" w:eastAsia="Arial"/>
-                <w:b w:val="0"/>
-                <w:i w:val="0"/>
-                <w:sz w:val="17"/>
-              </w:rPr>
-              <w:t>Ministry of Health and Medical Education · National Student Research Committee, Iran</w:t>
-            </w:r>
-          </w:p>
-        </w:tc>
-      </w:tr>
-    </w:tbl>
-    <w:p>
-      <w:pPr>
-        <w:spacing w:after="40" w:before="0"/>
-      </w:pPr>
-    </w:p>
-    <w:p>
-      <w:pPr>
-        <w:spacing w:before="180" w:after="60"/>
-        <w:pBdr>
-          <w:bottom w:val="single" w:sz="6" w:space="1" w:color="B8953A"/>
-        </w:pBdr>
-      </w:pPr>
-      <w:r>
-        <w:rPr>
-          <w:rFonts w:ascii="Arial" w:hAnsi="Arial" w:eastAsia="Arial"/>
-          <w:b/>
-          <w:i w:val="0"/>
-          <w:color w:val="1F3864"/>
-          <w:sz w:val="21"/>
-        </w:rPr>
-        <w:t>LEADERSHIP &amp; COMMUNITY SERVICE</w:t>
-      </w:r>
-    </w:p>
-    <w:tbl>
-      <w:tblPr>
-        <w:tblStyle w:val="TableGrid"/>
-        <w:tblW w:type="auto" w:w="0"/>
-        <w:jc w:val="left"/>
-        <w:tblLayout w:type="autofit"/>
-        <w:tblLook w:firstColumn="1" w:firstRow="1" w:lastColumn="0" w:lastRow="0" w:noHBand="0" w:noVBand="1" w:val="04A0"/>
-      </w:tblPr>
-      <w:tblGrid>
-        <w:gridCol w:w="2592"/>
-        <w:gridCol w:w="2592"/>
-        <w:gridCol w:w="2592"/>
-        <w:gridCol w:w="2592"/>
-      </w:tblGrid>
-      <w:tr>
-        <w:tc>
-          <w:tcPr>
-            <w:tcW w:type="dxa" w:w="2592"/>
-            <w:vAlign w:val="center"/>
-            <w:shd w:fill="D9EAF7"/>
-          </w:tcPr>
-          <w:p>
-            <w:pPr>
-              <w:spacing w:after="0"/>
-            </w:pPr>
-            <w:r/>
-            <w:r>
-              <w:rPr>
-                <w:rFonts w:ascii="Arial" w:hAnsi="Arial" w:eastAsia="Arial"/>
-                <w:b/>
-                <w:i w:val="0"/>
-                <w:color w:val="1F3864"/>
-                <w:sz w:val="17"/>
-              </w:rPr>
-              <w:t>Period</w:t>
-            </w:r>
-          </w:p>
-        </w:tc>
-        <w:tc>
-          <w:tcPr>
-            <w:tcW w:type="dxa" w:w="2592"/>
-            <w:vAlign w:val="center"/>
-            <w:shd w:fill="D9EAF7"/>
-          </w:tcPr>
-          <w:p>
-            <w:pPr>
-              <w:spacing w:after="0"/>
-            </w:pPr>
-            <w:r/>
-            <w:r>
-              <w:rPr>
-                <w:rFonts w:ascii="Arial" w:hAnsi="Arial" w:eastAsia="Arial"/>
-                <w:b/>
-                <w:i w:val="0"/>
-                <w:color w:val="1F3864"/>
-                <w:sz w:val="17"/>
-              </w:rPr>
-              <w:t>Role</w:t>
-            </w:r>
-          </w:p>
-        </w:tc>
-        <w:tc>
-          <w:tcPr>
-            <w:tcW w:type="dxa" w:w="2592"/>
-            <w:vAlign w:val="center"/>
-            <w:shd w:fill="D9EAF7"/>
-          </w:tcPr>
-          <w:p>
-            <w:pPr>
-              <w:spacing w:after="0"/>
-            </w:pPr>
-            <w:r/>
-            <w:r>
-              <w:rPr>
-                <w:rFonts w:ascii="Arial" w:hAnsi="Arial" w:eastAsia="Arial"/>
-                <w:b/>
-                <w:i w:val="0"/>
-                <w:color w:val="1F3864"/>
-                <w:sz w:val="17"/>
-              </w:rPr>
-              <w:t>Organization</w:t>
-            </w:r>
-          </w:p>
-        </w:tc>
-        <w:tc>
-          <w:tcPr>
-            <w:tcW w:type="dxa" w:w="2592"/>
-            <w:vAlign w:val="center"/>
-            <w:shd w:fill="D9EAF7"/>
-          </w:tcPr>
-          <w:p>
-            <w:pPr>
-              <w:spacing w:after="0"/>
-            </w:pPr>
-            <w:r/>
-            <w:r>
-              <w:rPr>
-                <w:rFonts w:ascii="Arial" w:hAnsi="Arial" w:eastAsia="Arial"/>
-                <w:b/>
-                <w:i w:val="0"/>
-                <w:color w:val="1F3864"/>
-                <w:sz w:val="17"/>
-              </w:rPr>
-              <w:t>Description</w:t>
-            </w:r>
-          </w:p>
-        </w:tc>
-      </w:tr>
-      <w:tr>
-        <w:tc>
-          <w:tcPr>
-            <w:tcW w:type="dxa" w:w="2592"/>
-            <w:vAlign w:val="center"/>
-          </w:tcPr>
-          <w:p>
-            <w:pPr>
-              <w:spacing w:after="0"/>
-            </w:pPr>
-            <w:r/>
-            <w:r>
-              <w:rPr>
-                <w:rFonts w:ascii="Arial" w:hAnsi="Arial" w:eastAsia="Arial"/>
-                <w:b w:val="0"/>
-                <w:i w:val="0"/>
-                <w:sz w:val="17"/>
-              </w:rPr>
-              <w:t>2020 – Present</w:t>
-            </w:r>
-          </w:p>
-        </w:tc>
-        <w:tc>
-          <w:tcPr>
-            <w:tcW w:type="dxa" w:w="2592"/>
-            <w:vAlign w:val="center"/>
-          </w:tcPr>
-          <w:p>
-            <w:pPr>
-              <w:spacing w:after="0"/>
-            </w:pPr>
-            <w:r/>
-            <w:r>
-              <w:rPr>
-                <w:rFonts w:ascii="Arial" w:hAnsi="Arial" w:eastAsia="Arial"/>
-                <w:b w:val="0"/>
-                <w:i w:val="0"/>
-                <w:sz w:val="17"/>
-              </w:rPr>
-              <w:t>Research Project Inspector &amp; Mentoring Program — Founder and Director</w:t>
-            </w:r>
-          </w:p>
-        </w:tc>
-        <w:tc>
-          <w:tcPr>
-            <w:tcW w:type="dxa" w:w="2592"/>
-            <w:vAlign w:val="center"/>
-          </w:tcPr>
-          <w:p>
-            <w:pPr>
-              <w:spacing w:after="0"/>
-            </w:pPr>
-            <w:r/>
-            <w:r>
-              <w:rPr>
-                <w:rFonts w:ascii="Arial" w:hAnsi="Arial" w:eastAsia="Arial"/>
-                <w:b w:val="0"/>
-                <w:i w:val="0"/>
-                <w:sz w:val="17"/>
-              </w:rPr>
-              <w:t>Thoracic and Vascular Surgery Research Center · Shiraz University of Medical Sciences · Shiraz, Iran</w:t>
-            </w:r>
-          </w:p>
-        </w:tc>
-        <w:tc>
-          <w:tcPr>
-            <w:tcW w:type="dxa" w:w="2592"/>
-            <w:vAlign w:val="center"/>
-          </w:tcPr>
-          <w:p>
-            <w:pPr>
-              <w:spacing w:after="0"/>
-            </w:pPr>
-            <w:r/>
-            <w:r>
-              <w:rPr>
-                <w:rFonts w:ascii="Arial" w:hAnsi="Arial" w:eastAsia="Arial"/>
-                <w:b w:val="0"/>
-                <w:i w:val="0"/>
-                <w:sz w:val="17"/>
-              </w:rPr>
-              <w:t>Founded and directed a research mentoring program at the Thoracic and Vascular Surgery Research Center, mentoring 15 medical students in research methodology, scientific writing, and publication strategy, with participating students contributing to more than 50 peer-reviewed publications.</w:t>
-            </w:r>
-          </w:p>
-        </w:tc>
-      </w:tr>
-    </w:tbl>
-    <w:p>
-      <w:pPr>
-        <w:spacing w:after="40" w:before="0"/>
-      </w:pPr>
-    </w:p>
-    <w:p>
-      <w:pPr>
-        <w:spacing w:before="180" w:after="60"/>
-        <w:pBdr>
-          <w:bottom w:val="single" w:sz="6" w:space="1" w:color="B8953A"/>
-        </w:pBdr>
-      </w:pPr>
-      <w:r>
-        <w:rPr>
-          <w:rFonts w:ascii="Arial" w:hAnsi="Arial" w:eastAsia="Arial"/>
-          <w:b/>
-          <w:i w:val="0"/>
-          <w:color w:val="1F3864"/>
-          <w:sz w:val="21"/>
-        </w:rPr>
-        <w:t>SKILLS</w:t>
-      </w:r>
-    </w:p>
-    <w:tbl>
-      <w:tblPr>
-        <w:tblStyle w:val="TableGrid"/>
-        <w:tblW w:type="auto" w:w="0"/>
-        <w:jc w:val="left"/>
-        <w:tblLayout w:type="autofit"/>
-        <w:tblLook w:firstColumn="1" w:firstRow="1" w:lastColumn="0" w:lastRow="0" w:noHBand="0" w:noVBand="1" w:val="04A0"/>
-      </w:tblPr>
-      <w:tblGrid>
-        <w:gridCol w:w="5184"/>
-        <w:gridCol w:w="5184"/>
-      </w:tblGrid>
-      <w:tr>
-        <w:tc>
-          <w:tcPr>
-            <w:tcW w:type="dxa" w:w="2016"/>
-            <w:vAlign w:val="center"/>
-          </w:tcPr>
-          <w:p>
-            <w:pPr>
-              <w:spacing w:after="0"/>
-            </w:pPr>
-            <w:r/>
-            <w:r>
-              <w:rPr>
-                <w:rFonts w:ascii="Arial" w:hAnsi="Arial" w:eastAsia="Arial"/>
-                <w:b w:val="0"/>
-                <w:i w:val="0"/>
-                <w:sz w:val="17"/>
-              </w:rPr>
-              <w:t>Computing</w:t>
-            </w:r>
-          </w:p>
-        </w:tc>
-        <w:tc>
-          <w:tcPr>
-            <w:tcW w:type="dxa" w:w="7488"/>
-            <w:vAlign w:val="center"/>
-          </w:tcPr>
-          <w:p>
-            <w:pPr>
-              <w:spacing w:after="0"/>
-            </w:pPr>
-            <w:r/>
-            <w:r>
-              <w:rPr>
-                <w:rFonts w:ascii="Arial" w:hAnsi="Arial" w:eastAsia="Arial"/>
-                <w:b w:val="0"/>
-                <w:i w:val="0"/>
-                <w:sz w:val="17"/>
-              </w:rPr>
-              <w:t>SPSS (Good); MS Office (Good); Endnote (Good); Corel Video Studio (Good); Python (Beginner); MATLAB (Beginner); NCSS (Beginner); Azure DevOps (Beginner); Typing (90 wpm)</w:t>
-            </w:r>
-          </w:p>
-        </w:tc>
-      </w:tr>
-      <w:tr>
-        <w:tc>
-          <w:tcPr>
-            <w:tcW w:type="dxa" w:w="2016"/>
-            <w:vAlign w:val="center"/>
-          </w:tcPr>
-          <w:p>
-            <w:pPr>
-              <w:spacing w:after="0"/>
-            </w:pPr>
-            <w:r/>
-            <w:r>
-              <w:rPr>
-                <w:rFonts w:ascii="Arial" w:hAnsi="Arial" w:eastAsia="Arial"/>
-                <w:b w:val="0"/>
-                <w:i w:val="0"/>
-                <w:sz w:val="17"/>
-              </w:rPr>
-              <w:t>Interpersonal</w:t>
-            </w:r>
-          </w:p>
-        </w:tc>
-        <w:tc>
-          <w:tcPr>
-            <w:tcW w:type="dxa" w:w="7488"/>
-            <w:vAlign w:val="center"/>
-          </w:tcPr>
-          <w:p>
-            <w:pPr>
-              <w:spacing w:after="0"/>
-            </w:pPr>
-            <w:r/>
-            <w:r>
-              <w:rPr>
-                <w:rFonts w:ascii="Arial" w:hAnsi="Arial" w:eastAsia="Arial"/>
-                <w:b w:val="0"/>
-                <w:i w:val="0"/>
-                <w:sz w:val="17"/>
-              </w:rPr>
-              <w:t>Leadership; Presentation; Time Management; Effective Listening; Team Player; Problem-Solving; Scientific Editing; Translation EN↔FA</w:t>
-            </w:r>
-          </w:p>
-        </w:tc>
-      </w:tr>
-    </w:tbl>
-    <w:p>
-      <w:pPr>
-        <w:spacing w:after="40" w:before="0"/>
-      </w:pPr>
-    </w:p>
-    <w:p>
-      <w:pPr>
-        <w:spacing w:before="180" w:after="60"/>
-        <w:pBdr>
-          <w:bottom w:val="single" w:sz="6" w:space="1" w:color="B8953A"/>
-        </w:pBdr>
-      </w:pPr>
-      <w:r>
-        <w:rPr>
-          <w:rFonts w:ascii="Arial" w:hAnsi="Arial" w:eastAsia="Arial"/>
-          <w:b/>
-          <w:i w:val="0"/>
-          <w:color w:val="1F3864"/>
-          <w:sz w:val="21"/>
-        </w:rPr>
-        <w:t>PATENTS AND INNOVATIONS</w:t>
-      </w:r>
-    </w:p>
-    <w:tbl>
-      <w:tblPr>
-        <w:tblStyle w:val="TableGrid"/>
-        <w:tblW w:type="auto" w:w="0"/>
-        <w:jc w:val="left"/>
-        <w:tblLayout w:type="autofit"/>
-        <w:tblLook w:firstColumn="1" w:firstRow="1" w:lastColumn="0" w:lastRow="0" w:noHBand="0" w:noVBand="1" w:val="04A0"/>
-      </w:tblPr>
-      <w:tblGrid>
-        <w:gridCol w:w="2592"/>
-        <w:gridCol w:w="2592"/>
-        <w:gridCol w:w="2592"/>
-        <w:gridCol w:w="2592"/>
-      </w:tblGrid>
-      <w:tr>
-        <w:tc>
-          <w:tcPr>
-            <w:tcW w:type="dxa" w:w="2592"/>
-            <w:vAlign w:val="center"/>
-            <w:shd w:fill="D9EAF7"/>
-          </w:tcPr>
-          <w:p>
-            <w:pPr>
-              <w:spacing w:after="0"/>
-            </w:pPr>
-            <w:r/>
-            <w:r>
-              <w:rPr>
-                <w:rFonts w:ascii="Arial" w:hAnsi="Arial" w:eastAsia="Arial"/>
-                <w:b/>
-                <w:i w:val="0"/>
-                <w:color w:val="1F3864"/>
-                <w:sz w:val="17"/>
-              </w:rPr>
-              <w:t>Date</w:t>
-            </w:r>
-          </w:p>
-        </w:tc>
-        <w:tc>
-          <w:tcPr>
-            <w:tcW w:type="dxa" w:w="2592"/>
-            <w:vAlign w:val="center"/>
-            <w:shd w:fill="D9EAF7"/>
-          </w:tcPr>
-          <w:p>
-            <w:pPr>
-              <w:spacing w:after="0"/>
-            </w:pPr>
-            <w:r/>
-            <w:r>
-              <w:rPr>
-                <w:rFonts w:ascii="Arial" w:hAnsi="Arial" w:eastAsia="Arial"/>
-                <w:b/>
-                <w:i w:val="0"/>
-                <w:color w:val="1F3864"/>
-                <w:sz w:val="17"/>
-              </w:rPr>
-              <w:t>Title</w:t>
-            </w:r>
-          </w:p>
-        </w:tc>
-        <w:tc>
-          <w:tcPr>
-            <w:tcW w:type="dxa" w:w="2592"/>
-            <w:vAlign w:val="center"/>
-            <w:shd w:fill="D9EAF7"/>
-          </w:tcPr>
-          <w:p>
-            <w:pPr>
-              <w:spacing w:after="0"/>
-            </w:pPr>
-            <w:r/>
-            <w:r>
-              <w:rPr>
-                <w:rFonts w:ascii="Arial" w:hAnsi="Arial" w:eastAsia="Arial"/>
-                <w:b/>
-                <w:i w:val="0"/>
-                <w:color w:val="1F3864"/>
-                <w:sz w:val="17"/>
-              </w:rPr>
-              <w:t>Issuer</w:t>
-            </w:r>
-          </w:p>
-        </w:tc>
-        <w:tc>
-          <w:tcPr>
-            <w:tcW w:type="dxa" w:w="2592"/>
-            <w:vAlign w:val="center"/>
-            <w:shd w:fill="D9EAF7"/>
-          </w:tcPr>
-          <w:p>
-            <w:pPr>
-              <w:spacing w:after="0"/>
-            </w:pPr>
-            <w:r/>
-            <w:r>
-              <w:rPr>
-                <w:rFonts w:ascii="Arial" w:hAnsi="Arial" w:eastAsia="Arial"/>
-                <w:b/>
-                <w:i w:val="0"/>
-                <w:color w:val="1F3864"/>
-                <w:sz w:val="17"/>
-              </w:rPr>
-              <w:t>Number</w:t>
-            </w:r>
-          </w:p>
-        </w:tc>
-      </w:tr>
-      <w:tr>
-        <w:tc>
-          <w:tcPr>
-            <w:tcW w:type="dxa" w:w="2592"/>
-            <w:vAlign w:val="center"/>
-          </w:tcPr>
-          <w:p>
-            <w:pPr>
-              <w:spacing w:after="0"/>
-            </w:pPr>
-            <w:r/>
-            <w:r>
-              <w:rPr>
-                <w:rFonts w:ascii="Arial" w:hAnsi="Arial" w:eastAsia="Arial"/>
-                <w:b w:val="0"/>
-                <w:i w:val="0"/>
-                <w:sz w:val="17"/>
-              </w:rPr>
-              <w:t>Apr 2021</w:t>
-            </w:r>
-          </w:p>
-        </w:tc>
-        <w:tc>
-          <w:tcPr>
-            <w:tcW w:type="dxa" w:w="2592"/>
-            <w:vAlign w:val="center"/>
-          </w:tcPr>
-          <w:p>
-            <w:pPr>
-              <w:spacing w:after="0"/>
-            </w:pPr>
-            <w:r/>
-            <w:r>
-              <w:rPr>
-                <w:rFonts w:ascii="Arial" w:hAnsi="Arial" w:eastAsia="Arial"/>
-                <w:b w:val="0"/>
-                <w:i w:val="0"/>
-                <w:sz w:val="17"/>
-              </w:rPr>
-              <w:t>A Machine Learning-Based System for Detecting Leishmaniasis in Microscopic Images</w:t>
-            </w:r>
-          </w:p>
-        </w:tc>
-        <w:tc>
-          <w:tcPr>
-            <w:tcW w:type="dxa" w:w="2592"/>
-            <w:vAlign w:val="center"/>
-          </w:tcPr>
-          <w:p>
-            <w:pPr>
-              <w:spacing w:after="0"/>
-            </w:pPr>
-            <w:r/>
-            <w:r>
-              <w:rPr>
-                <w:rFonts w:ascii="Arial" w:hAnsi="Arial" w:eastAsia="Arial"/>
-                <w:b w:val="0"/>
-                <w:i w:val="0"/>
-                <w:sz w:val="17"/>
-              </w:rPr>
-              <w:t>IR</w:t>
-            </w:r>
-          </w:p>
-        </w:tc>
-        <w:tc>
-          <w:tcPr>
-            <w:tcW w:type="dxa" w:w="2592"/>
-            <w:vAlign w:val="center"/>
-          </w:tcPr>
-          <w:p>
-            <w:pPr>
-              <w:spacing w:after="0"/>
-            </w:pPr>
-            <w:r/>
-            <w:r>
-              <w:rPr>
-                <w:rFonts w:ascii="Arial" w:hAnsi="Arial" w:eastAsia="Arial"/>
-                <w:b w:val="0"/>
-                <w:i w:val="0"/>
-                <w:sz w:val="17"/>
-              </w:rPr>
-              <w:t>140050140003000416</w:t>
-            </w:r>
-          </w:p>
-        </w:tc>
-      </w:tr>
-      <w:tr>
-        <w:tc>
-          <w:tcPr>
-            <w:tcW w:type="dxa" w:w="2592"/>
-            <w:vAlign w:val="center"/>
-          </w:tcPr>
-          <w:p>
-            <w:pPr>
-              <w:spacing w:after="0"/>
-            </w:pPr>
-            <w:r/>
-            <w:r>
-              <w:rPr>
-                <w:rFonts w:ascii="Arial" w:hAnsi="Arial" w:eastAsia="Arial"/>
-                <w:b w:val="0"/>
-                <w:i w:val="0"/>
-                <w:sz w:val="17"/>
-              </w:rPr>
-              <w:t>Oct 2020</w:t>
-            </w:r>
-          </w:p>
-        </w:tc>
-        <w:tc>
-          <w:tcPr>
-            <w:tcW w:type="dxa" w:w="2592"/>
-            <w:vAlign w:val="center"/>
-          </w:tcPr>
-          <w:p>
-            <w:pPr>
-              <w:spacing w:after="0"/>
-            </w:pPr>
-            <w:r/>
-            <w:r>
-              <w:rPr>
-                <w:rFonts w:ascii="Arial" w:hAnsi="Arial" w:eastAsia="Arial"/>
-                <w:b w:val="0"/>
-                <w:i w:val="0"/>
-                <w:sz w:val="17"/>
-              </w:rPr>
-              <w:t>Utilization of Chest Tube in Pediatric Caustic Injuries: A New Method for Esophageal Stenting</w:t>
-            </w:r>
-          </w:p>
-        </w:tc>
-        <w:tc>
-          <w:tcPr>
-            <w:tcW w:type="dxa" w:w="2592"/>
-            <w:vAlign w:val="center"/>
-          </w:tcPr>
-          <w:p>
-            <w:pPr>
-              <w:spacing w:after="0"/>
-            </w:pPr>
-            <w:r/>
-            <w:r>
-              <w:rPr>
-                <w:rFonts w:ascii="Arial" w:hAnsi="Arial" w:eastAsia="Arial"/>
-                <w:b w:val="0"/>
-                <w:i w:val="0"/>
-                <w:sz w:val="17"/>
-              </w:rPr>
-              <w:t>IR</w:t>
-            </w:r>
-          </w:p>
-        </w:tc>
-        <w:tc>
-          <w:tcPr>
-            <w:tcW w:type="dxa" w:w="2592"/>
-            <w:vAlign w:val="center"/>
-          </w:tcPr>
-          <w:p>
-            <w:pPr>
-              <w:spacing w:after="0"/>
-            </w:pPr>
-            <w:r/>
-            <w:r>
-              <w:rPr>
-                <w:rFonts w:ascii="Arial" w:hAnsi="Arial" w:eastAsia="Arial"/>
-                <w:b w:val="0"/>
-                <w:i w:val="0"/>
-                <w:sz w:val="17"/>
-              </w:rPr>
-              <w:t>139950140003006653</w:t>
-            </w:r>
-          </w:p>
-        </w:tc>
-      </w:tr>
-    </w:tbl>
-    <w:p>
-      <w:pPr>
-        <w:spacing w:after="40" w:before="0"/>
-      </w:pPr>
+          <w:b w:val="0"/>
+          <w:i w:val="0"/>
+          <w:sz w:val="18"/>
+        </w:rPr>
+        <w:t>Physician-scientist and research fellow focused on surgical innovation, artificial intelligence in medicine, digital health, patient-centered outcomes, and surgical education. My work includes developing clinical research tools, leading multidisciplinary projects, evaluating online health information, designing AI- and computer vision-based studies, and translating clinical problems into practical scientific and technological solutions. My long-term goal is to become a surgeon-scientist who advances surgical care through innovative, evidence-based, and patient-centered approaches.</w:t>
+      </w:r>
     </w:p>
     <w:p>
       <w:pPr>
@@ -2456,7 +439,2590 @@
                 <w:i w:val="0"/>
                 <w:sz w:val="17"/>
               </w:rPr>
-              <w:t>3425</w:t>
+              <w:t>3428</w:t>
+            </w:r>
+          </w:p>
+        </w:tc>
+      </w:tr>
+    </w:tbl>
+    <w:p>
+      <w:pPr>
+        <w:spacing w:after="40" w:before="0"/>
+      </w:pPr>
+    </w:p>
+    <w:p>
+      <w:pPr>
+        <w:spacing w:before="180" w:after="60"/>
+        <w:pBdr>
+          <w:bottom w:val="single" w:sz="6" w:space="1" w:color="B8953A"/>
+        </w:pBdr>
+      </w:pPr>
+      <w:r>
+        <w:rPr>
+          <w:rFonts w:ascii="Arial" w:hAnsi="Arial" w:eastAsia="Arial"/>
+          <w:b/>
+          <w:i w:val="0"/>
+          <w:color w:val="1F3864"/>
+          <w:sz w:val="21"/>
+        </w:rPr>
+        <w:t>PERSONAL INFORMATION</w:t>
+      </w:r>
+    </w:p>
+    <w:tbl>
+      <w:tblPr>
+        <w:tblStyle w:val="TableGrid"/>
+        <w:tblW w:type="auto" w:w="0"/>
+        <w:jc w:val="left"/>
+        <w:tblLayout w:type="autofit"/>
+        <w:tblLook w:firstColumn="1" w:firstRow="1" w:lastColumn="0" w:lastRow="0" w:noHBand="0" w:noVBand="1" w:val="04A0"/>
+      </w:tblPr>
+      <w:tblGrid>
+        <w:gridCol w:w="5184"/>
+        <w:gridCol w:w="5184"/>
+      </w:tblGrid>
+      <w:tr>
+        <w:tc>
+          <w:tcPr>
+            <w:tcW w:type="dxa" w:w="2664"/>
+            <w:vAlign w:val="center"/>
+          </w:tcPr>
+          <w:p>
+            <w:pPr>
+              <w:spacing w:after="0"/>
+            </w:pPr>
+            <w:r/>
+            <w:r>
+              <w:rPr>
+                <w:rFonts w:ascii="Arial" w:hAnsi="Arial" w:eastAsia="Arial"/>
+                <w:b w:val="0"/>
+                <w:i w:val="0"/>
+                <w:sz w:val="17"/>
+              </w:rPr>
+              <w:t>Surname</w:t>
+            </w:r>
+          </w:p>
+        </w:tc>
+        <w:tc>
+          <w:tcPr>
+            <w:tcW w:type="dxa" w:w="6840"/>
+            <w:vAlign w:val="center"/>
+          </w:tcPr>
+          <w:p>
+            <w:pPr>
+              <w:spacing w:after="0"/>
+            </w:pPr>
+            <w:r/>
+            <w:r>
+              <w:rPr>
+                <w:rFonts w:ascii="Arial" w:hAnsi="Arial" w:eastAsia="Arial"/>
+                <w:b w:val="0"/>
+                <w:i w:val="0"/>
+                <w:sz w:val="17"/>
+              </w:rPr>
+              <w:t>Shahriarirad</w:t>
+            </w:r>
+          </w:p>
+        </w:tc>
+      </w:tr>
+      <w:tr>
+        <w:tc>
+          <w:tcPr>
+            <w:tcW w:type="dxa" w:w="2664"/>
+            <w:vAlign w:val="center"/>
+          </w:tcPr>
+          <w:p>
+            <w:pPr>
+              <w:spacing w:after="0"/>
+            </w:pPr>
+            <w:r/>
+            <w:r>
+              <w:rPr>
+                <w:rFonts w:ascii="Arial" w:hAnsi="Arial" w:eastAsia="Arial"/>
+                <w:b w:val="0"/>
+                <w:i w:val="0"/>
+                <w:sz w:val="17"/>
+              </w:rPr>
+              <w:t>Given name</w:t>
+            </w:r>
+          </w:p>
+        </w:tc>
+        <w:tc>
+          <w:tcPr>
+            <w:tcW w:type="dxa" w:w="6840"/>
+            <w:vAlign w:val="center"/>
+          </w:tcPr>
+          <w:p>
+            <w:pPr>
+              <w:spacing w:after="0"/>
+            </w:pPr>
+            <w:r/>
+            <w:r>
+              <w:rPr>
+                <w:rFonts w:ascii="Arial" w:hAnsi="Arial" w:eastAsia="Arial"/>
+                <w:b w:val="0"/>
+                <w:i w:val="0"/>
+                <w:sz w:val="17"/>
+              </w:rPr>
+              <w:t>Reza</w:t>
+            </w:r>
+          </w:p>
+        </w:tc>
+      </w:tr>
+      <w:tr>
+        <w:tc>
+          <w:tcPr>
+            <w:tcW w:type="dxa" w:w="2664"/>
+            <w:vAlign w:val="center"/>
+          </w:tcPr>
+          <w:p>
+            <w:pPr>
+              <w:spacing w:after="0"/>
+            </w:pPr>
+            <w:r/>
+            <w:r>
+              <w:rPr>
+                <w:rFonts w:ascii="Arial" w:hAnsi="Arial" w:eastAsia="Arial"/>
+                <w:b w:val="0"/>
+                <w:i w:val="0"/>
+                <w:sz w:val="17"/>
+              </w:rPr>
+              <w:t>Current residence</w:t>
+            </w:r>
+          </w:p>
+        </w:tc>
+        <w:tc>
+          <w:tcPr>
+            <w:tcW w:type="dxa" w:w="6840"/>
+            <w:vAlign w:val="center"/>
+          </w:tcPr>
+          <w:p>
+            <w:pPr>
+              <w:spacing w:after="0"/>
+            </w:pPr>
+            <w:r/>
+            <w:r>
+              <w:rPr>
+                <w:rFonts w:ascii="Arial" w:hAnsi="Arial" w:eastAsia="Arial"/>
+                <w:b w:val="0"/>
+                <w:i w:val="0"/>
+                <w:sz w:val="17"/>
+              </w:rPr>
+              <w:t>Rochester, MN, USA</w:t>
+            </w:r>
+          </w:p>
+        </w:tc>
+      </w:tr>
+      <w:tr>
+        <w:tc>
+          <w:tcPr>
+            <w:tcW w:type="dxa" w:w="2664"/>
+            <w:vAlign w:val="center"/>
+          </w:tcPr>
+          <w:p>
+            <w:pPr>
+              <w:spacing w:after="0"/>
+            </w:pPr>
+            <w:r/>
+            <w:r>
+              <w:rPr>
+                <w:rFonts w:ascii="Arial" w:hAnsi="Arial" w:eastAsia="Arial"/>
+                <w:b w:val="0"/>
+                <w:i w:val="0"/>
+                <w:sz w:val="17"/>
+              </w:rPr>
+              <w:t>Date of writing CV</w:t>
+            </w:r>
+          </w:p>
+        </w:tc>
+        <w:tc>
+          <w:tcPr>
+            <w:tcW w:type="dxa" w:w="6840"/>
+            <w:vAlign w:val="center"/>
+          </w:tcPr>
+          <w:p>
+            <w:pPr>
+              <w:spacing w:after="0"/>
+            </w:pPr>
+            <w:r/>
+            <w:r>
+              <w:rPr>
+                <w:rFonts w:ascii="Arial" w:hAnsi="Arial" w:eastAsia="Arial"/>
+                <w:b w:val="0"/>
+                <w:i w:val="0"/>
+                <w:sz w:val="17"/>
+              </w:rPr>
+              <w:t>May 26, 2026</w:t>
+            </w:r>
+          </w:p>
+        </w:tc>
+      </w:tr>
+      <w:tr>
+        <w:tc>
+          <w:tcPr>
+            <w:tcW w:type="dxa" w:w="2664"/>
+            <w:vAlign w:val="center"/>
+          </w:tcPr>
+          <w:p>
+            <w:pPr>
+              <w:spacing w:after="0"/>
+            </w:pPr>
+            <w:r/>
+            <w:r>
+              <w:rPr>
+                <w:rFonts w:ascii="Arial" w:hAnsi="Arial" w:eastAsia="Arial"/>
+                <w:b w:val="0"/>
+                <w:i w:val="0"/>
+                <w:sz w:val="17"/>
+              </w:rPr>
+              <w:t>Verified reviews / peer reviews</w:t>
+            </w:r>
+          </w:p>
+        </w:tc>
+        <w:tc>
+          <w:tcPr>
+            <w:tcW w:type="dxa" w:w="6840"/>
+            <w:vAlign w:val="center"/>
+          </w:tcPr>
+          <w:p>
+            <w:pPr>
+              <w:spacing w:after="0"/>
+            </w:pPr>
+            <w:r/>
+            <w:r>
+              <w:rPr>
+                <w:rFonts w:ascii="Arial" w:hAnsi="Arial" w:eastAsia="Arial"/>
+                <w:b w:val="0"/>
+                <w:i w:val="0"/>
+                <w:sz w:val="17"/>
+              </w:rPr>
+              <w:t>149</w:t>
+            </w:r>
+          </w:p>
+        </w:tc>
+      </w:tr>
+      <w:tr>
+        <w:tc>
+          <w:tcPr>
+            <w:tcW w:type="dxa" w:w="2664"/>
+            <w:vAlign w:val="center"/>
+          </w:tcPr>
+          <w:p>
+            <w:pPr>
+              <w:spacing w:after="0"/>
+            </w:pPr>
+            <w:r/>
+            <w:r>
+              <w:rPr>
+                <w:rFonts w:ascii="Arial" w:hAnsi="Arial" w:eastAsia="Arial"/>
+                <w:b w:val="0"/>
+                <w:i w:val="0"/>
+                <w:sz w:val="17"/>
+              </w:rPr>
+              <w:t>Total citations</w:t>
+            </w:r>
+          </w:p>
+        </w:tc>
+        <w:tc>
+          <w:tcPr>
+            <w:tcW w:type="dxa" w:w="6840"/>
+            <w:vAlign w:val="center"/>
+          </w:tcPr>
+          <w:p>
+            <w:pPr>
+              <w:spacing w:after="0"/>
+            </w:pPr>
+            <w:r/>
+            <w:r>
+              <w:rPr>
+                <w:rFonts w:ascii="Arial" w:hAnsi="Arial" w:eastAsia="Arial"/>
+                <w:b w:val="0"/>
+                <w:i w:val="0"/>
+                <w:sz w:val="17"/>
+              </w:rPr>
+              <w:t>3428</w:t>
+            </w:r>
+          </w:p>
+        </w:tc>
+      </w:tr>
+      <w:tr>
+        <w:tc>
+          <w:tcPr>
+            <w:tcW w:type="dxa" w:w="2664"/>
+            <w:vAlign w:val="center"/>
+          </w:tcPr>
+          <w:p>
+            <w:pPr>
+              <w:spacing w:after="0"/>
+            </w:pPr>
+            <w:r/>
+            <w:r>
+              <w:rPr>
+                <w:rFonts w:ascii="Arial" w:hAnsi="Arial" w:eastAsia="Arial"/>
+                <w:b w:val="0"/>
+                <w:i w:val="0"/>
+                <w:sz w:val="17"/>
+              </w:rPr>
+              <w:t>H-index</w:t>
+            </w:r>
+          </w:p>
+        </w:tc>
+        <w:tc>
+          <w:tcPr>
+            <w:tcW w:type="dxa" w:w="6840"/>
+            <w:vAlign w:val="center"/>
+          </w:tcPr>
+          <w:p>
+            <w:pPr>
+              <w:spacing w:after="0"/>
+            </w:pPr>
+            <w:r/>
+            <w:r>
+              <w:rPr>
+                <w:rFonts w:ascii="Arial" w:hAnsi="Arial" w:eastAsia="Arial"/>
+                <w:b w:val="0"/>
+                <w:i w:val="0"/>
+                <w:sz w:val="17"/>
+              </w:rPr>
+              <w:t>24</w:t>
+            </w:r>
+          </w:p>
+        </w:tc>
+      </w:tr>
+      <w:tr>
+        <w:tc>
+          <w:tcPr>
+            <w:tcW w:type="dxa" w:w="2664"/>
+            <w:vAlign w:val="center"/>
+          </w:tcPr>
+          <w:p>
+            <w:pPr>
+              <w:spacing w:after="0"/>
+            </w:pPr>
+            <w:r/>
+            <w:r>
+              <w:rPr>
+                <w:rFonts w:ascii="Arial" w:hAnsi="Arial" w:eastAsia="Arial"/>
+                <w:b w:val="0"/>
+                <w:i w:val="0"/>
+                <w:sz w:val="17"/>
+              </w:rPr>
+              <w:t>Research interests</w:t>
+            </w:r>
+          </w:p>
+        </w:tc>
+        <w:tc>
+          <w:tcPr>
+            <w:tcW w:type="dxa" w:w="6840"/>
+            <w:vAlign w:val="center"/>
+          </w:tcPr>
+          <w:p>
+            <w:pPr>
+              <w:spacing w:after="0"/>
+            </w:pPr>
+            <w:r/>
+            <w:r>
+              <w:rPr>
+                <w:rFonts w:ascii="Arial" w:hAnsi="Arial" w:eastAsia="Arial"/>
+                <w:b w:val="0"/>
+                <w:i w:val="0"/>
+                <w:sz w:val="17"/>
+              </w:rPr>
+              <w:t>Surgery · Minimally Invasive Surgery · Artificial Intelligence</w:t>
+            </w:r>
+          </w:p>
+        </w:tc>
+      </w:tr>
+    </w:tbl>
+    <w:p>
+      <w:pPr>
+        <w:spacing w:after="40" w:before="0"/>
+      </w:pPr>
+    </w:p>
+    <w:p>
+      <w:pPr>
+        <w:spacing w:before="180" w:after="60"/>
+        <w:pBdr>
+          <w:bottom w:val="single" w:sz="6" w:space="1" w:color="B8953A"/>
+        </w:pBdr>
+      </w:pPr>
+      <w:r>
+        <w:rPr>
+          <w:rFonts w:ascii="Arial" w:hAnsi="Arial" w:eastAsia="Arial"/>
+          <w:b/>
+          <w:i w:val="0"/>
+          <w:color w:val="1F3864"/>
+          <w:sz w:val="21"/>
+        </w:rPr>
+        <w:t>EDUCATION</w:t>
+      </w:r>
+    </w:p>
+    <w:tbl>
+      <w:tblPr>
+        <w:tblStyle w:val="TableGrid"/>
+        <w:tblW w:type="auto" w:w="0"/>
+        <w:jc w:val="left"/>
+        <w:tblLayout w:type="autofit"/>
+        <w:tblLook w:firstColumn="1" w:firstRow="1" w:lastColumn="0" w:lastRow="0" w:noHBand="0" w:noVBand="1" w:val="04A0"/>
+      </w:tblPr>
+      <w:tblGrid>
+        <w:gridCol w:w="2592"/>
+        <w:gridCol w:w="2592"/>
+        <w:gridCol w:w="2592"/>
+        <w:gridCol w:w="2592"/>
+      </w:tblGrid>
+      <w:tr>
+        <w:tc>
+          <w:tcPr>
+            <w:tcW w:type="dxa" w:w="2592"/>
+            <w:vAlign w:val="center"/>
+            <w:shd w:fill="D9EAF7"/>
+          </w:tcPr>
+          <w:p>
+            <w:pPr>
+              <w:spacing w:after="0"/>
+            </w:pPr>
+            <w:r/>
+            <w:r>
+              <w:rPr>
+                <w:rFonts w:ascii="Arial" w:hAnsi="Arial" w:eastAsia="Arial"/>
+                <w:b/>
+                <w:i w:val="0"/>
+                <w:color w:val="1F3864"/>
+                <w:sz w:val="17"/>
+              </w:rPr>
+              <w:t>Period</w:t>
+            </w:r>
+          </w:p>
+        </w:tc>
+        <w:tc>
+          <w:tcPr>
+            <w:tcW w:type="dxa" w:w="2592"/>
+            <w:vAlign w:val="center"/>
+            <w:shd w:fill="D9EAF7"/>
+          </w:tcPr>
+          <w:p>
+            <w:pPr>
+              <w:spacing w:after="0"/>
+            </w:pPr>
+            <w:r/>
+            <w:r>
+              <w:rPr>
+                <w:rFonts w:ascii="Arial" w:hAnsi="Arial" w:eastAsia="Arial"/>
+                <w:b/>
+                <w:i w:val="0"/>
+                <w:color w:val="1F3864"/>
+                <w:sz w:val="17"/>
+              </w:rPr>
+              <w:t>Degree</w:t>
+            </w:r>
+          </w:p>
+        </w:tc>
+        <w:tc>
+          <w:tcPr>
+            <w:tcW w:type="dxa" w:w="2592"/>
+            <w:vAlign w:val="center"/>
+            <w:shd w:fill="D9EAF7"/>
+          </w:tcPr>
+          <w:p>
+            <w:pPr>
+              <w:spacing w:after="0"/>
+            </w:pPr>
+            <w:r/>
+            <w:r>
+              <w:rPr>
+                <w:rFonts w:ascii="Arial" w:hAnsi="Arial" w:eastAsia="Arial"/>
+                <w:b/>
+                <w:i w:val="0"/>
+                <w:color w:val="1F3864"/>
+                <w:sz w:val="17"/>
+              </w:rPr>
+              <w:t>Institution</w:t>
+            </w:r>
+          </w:p>
+        </w:tc>
+        <w:tc>
+          <w:tcPr>
+            <w:tcW w:type="dxa" w:w="2592"/>
+            <w:vAlign w:val="center"/>
+            <w:shd w:fill="D9EAF7"/>
+          </w:tcPr>
+          <w:p>
+            <w:pPr>
+              <w:spacing w:after="0"/>
+            </w:pPr>
+            <w:r/>
+            <w:r>
+              <w:rPr>
+                <w:rFonts w:ascii="Arial" w:hAnsi="Arial" w:eastAsia="Arial"/>
+                <w:b/>
+                <w:i w:val="0"/>
+                <w:color w:val="1F3864"/>
+                <w:sz w:val="17"/>
+              </w:rPr>
+              <w:t>Location</w:t>
+            </w:r>
+          </w:p>
+        </w:tc>
+      </w:tr>
+      <w:tr>
+        <w:tc>
+          <w:tcPr>
+            <w:tcW w:type="dxa" w:w="2592"/>
+            <w:vAlign w:val="center"/>
+          </w:tcPr>
+          <w:p>
+            <w:pPr>
+              <w:spacing w:after="0"/>
+            </w:pPr>
+            <w:r/>
+            <w:r>
+              <w:rPr>
+                <w:rFonts w:ascii="Arial" w:hAnsi="Arial" w:eastAsia="Arial"/>
+                <w:b w:val="0"/>
+                <w:i w:val="0"/>
+                <w:sz w:val="17"/>
+              </w:rPr>
+              <w:t>2013 – 2020</w:t>
+            </w:r>
+          </w:p>
+        </w:tc>
+        <w:tc>
+          <w:tcPr>
+            <w:tcW w:type="dxa" w:w="2592"/>
+            <w:vAlign w:val="center"/>
+          </w:tcPr>
+          <w:p>
+            <w:pPr>
+              <w:spacing w:after="0"/>
+            </w:pPr>
+            <w:r/>
+            <w:r>
+              <w:rPr>
+                <w:rFonts w:ascii="Arial" w:hAnsi="Arial" w:eastAsia="Arial"/>
+                <w:b w:val="0"/>
+                <w:i w:val="0"/>
+                <w:sz w:val="17"/>
+              </w:rPr>
+              <w:t>Doctor of Medicine (M.D.)</w:t>
+            </w:r>
+          </w:p>
+        </w:tc>
+        <w:tc>
+          <w:tcPr>
+            <w:tcW w:type="dxa" w:w="2592"/>
+            <w:vAlign w:val="center"/>
+          </w:tcPr>
+          <w:p>
+            <w:pPr>
+              <w:spacing w:after="0"/>
+            </w:pPr>
+            <w:r/>
+            <w:r>
+              <w:rPr>
+                <w:rFonts w:ascii="Arial" w:hAnsi="Arial" w:eastAsia="Arial"/>
+                <w:b w:val="0"/>
+                <w:i w:val="0"/>
+                <w:sz w:val="17"/>
+              </w:rPr>
+              <w:t>Shiraz University of Medical Sciences · Shiraz, Iran (SUMS)</w:t>
+            </w:r>
+          </w:p>
+        </w:tc>
+        <w:tc>
+          <w:tcPr>
+            <w:tcW w:type="dxa" w:w="2592"/>
+            <w:vAlign w:val="center"/>
+          </w:tcPr>
+          <w:p>
+            <w:pPr>
+              <w:spacing w:after="0"/>
+            </w:pPr>
+            <w:r/>
+            <w:r>
+              <w:rPr>
+                <w:rFonts w:ascii="Arial" w:hAnsi="Arial" w:eastAsia="Arial"/>
+                <w:b w:val="0"/>
+                <w:i w:val="0"/>
+                <w:sz w:val="17"/>
+              </w:rPr>
+              <w:t>Shiraz, Iran</w:t>
+            </w:r>
+          </w:p>
+        </w:tc>
+      </w:tr>
+      <w:tr>
+        <w:tc>
+          <w:tcPr>
+            <w:tcW w:type="dxa" w:w="2592"/>
+            <w:vAlign w:val="center"/>
+          </w:tcPr>
+          <w:p>
+            <w:pPr>
+              <w:spacing w:after="0"/>
+            </w:pPr>
+            <w:r/>
+            <w:r>
+              <w:rPr>
+                <w:rFonts w:ascii="Arial" w:hAnsi="Arial" w:eastAsia="Arial"/>
+                <w:b w:val="0"/>
+                <w:i w:val="0"/>
+                <w:sz w:val="17"/>
+              </w:rPr>
+              <w:t>2009 – 2013</w:t>
+            </w:r>
+          </w:p>
+        </w:tc>
+        <w:tc>
+          <w:tcPr>
+            <w:tcW w:type="dxa" w:w="2592"/>
+            <w:vAlign w:val="center"/>
+          </w:tcPr>
+          <w:p>
+            <w:pPr>
+              <w:spacing w:after="0"/>
+            </w:pPr>
+            <w:r/>
+            <w:r>
+              <w:rPr>
+                <w:rFonts w:ascii="Arial" w:hAnsi="Arial" w:eastAsia="Arial"/>
+                <w:b w:val="0"/>
+                <w:i w:val="0"/>
+                <w:sz w:val="17"/>
+              </w:rPr>
+              <w:t>High School Diploma</w:t>
+            </w:r>
+          </w:p>
+        </w:tc>
+        <w:tc>
+          <w:tcPr>
+            <w:tcW w:type="dxa" w:w="2592"/>
+            <w:vAlign w:val="center"/>
+          </w:tcPr>
+          <w:p>
+            <w:pPr>
+              <w:spacing w:after="0"/>
+            </w:pPr>
+            <w:r/>
+            <w:r>
+              <w:rPr>
+                <w:rFonts w:ascii="Arial" w:hAnsi="Arial" w:eastAsia="Arial"/>
+                <w:b w:val="0"/>
+                <w:i w:val="0"/>
+                <w:sz w:val="17"/>
+              </w:rPr>
+              <w:t>National Organization for Development of Exceptional Talents (SAMPAD)</w:t>
+            </w:r>
+          </w:p>
+        </w:tc>
+        <w:tc>
+          <w:tcPr>
+            <w:tcW w:type="dxa" w:w="2592"/>
+            <w:vAlign w:val="center"/>
+          </w:tcPr>
+          <w:p>
+            <w:pPr>
+              <w:spacing w:after="0"/>
+            </w:pPr>
+            <w:r/>
+            <w:r>
+              <w:rPr>
+                <w:rFonts w:ascii="Arial" w:hAnsi="Arial" w:eastAsia="Arial"/>
+                <w:b w:val="0"/>
+                <w:i w:val="0"/>
+                <w:sz w:val="17"/>
+              </w:rPr>
+              <w:t>Shiraz, Iran</w:t>
+            </w:r>
+          </w:p>
+        </w:tc>
+      </w:tr>
+    </w:tbl>
+    <w:p>
+      <w:pPr>
+        <w:spacing w:after="40" w:before="0"/>
+      </w:pPr>
+    </w:p>
+    <w:p>
+      <w:pPr>
+        <w:spacing w:before="180" w:after="60"/>
+        <w:pBdr>
+          <w:bottom w:val="single" w:sz="6" w:space="1" w:color="B8953A"/>
+        </w:pBdr>
+      </w:pPr>
+      <w:r>
+        <w:rPr>
+          <w:rFonts w:ascii="Arial" w:hAnsi="Arial" w:eastAsia="Arial"/>
+          <w:b/>
+          <w:i w:val="0"/>
+          <w:color w:val="1F3864"/>
+          <w:sz w:val="21"/>
+        </w:rPr>
+        <w:t>WORKING AND PROFESSIONAL EXPERIENCE</w:t>
+      </w:r>
+    </w:p>
+    <w:tbl>
+      <w:tblPr>
+        <w:tblStyle w:val="TableGrid"/>
+        <w:tblW w:type="auto" w:w="0"/>
+        <w:jc w:val="left"/>
+        <w:tblLayout w:type="autofit"/>
+        <w:tblLook w:firstColumn="1" w:firstRow="1" w:lastColumn="0" w:lastRow="0" w:noHBand="0" w:noVBand="1" w:val="04A0"/>
+      </w:tblPr>
+      <w:tblGrid>
+        <w:gridCol w:w="2592"/>
+        <w:gridCol w:w="2592"/>
+        <w:gridCol w:w="2592"/>
+        <w:gridCol w:w="2592"/>
+      </w:tblGrid>
+      <w:tr>
+        <w:tc>
+          <w:tcPr>
+            <w:tcW w:type="dxa" w:w="2592"/>
+            <w:vAlign w:val="center"/>
+            <w:shd w:fill="D9EAF7"/>
+          </w:tcPr>
+          <w:p>
+            <w:pPr>
+              <w:spacing w:after="0"/>
+            </w:pPr>
+            <w:r/>
+            <w:r>
+              <w:rPr>
+                <w:rFonts w:ascii="Arial" w:hAnsi="Arial" w:eastAsia="Arial"/>
+                <w:b/>
+                <w:i w:val="0"/>
+                <w:color w:val="1F3864"/>
+                <w:sz w:val="17"/>
+              </w:rPr>
+              <w:t>Period</w:t>
+            </w:r>
+          </w:p>
+        </w:tc>
+        <w:tc>
+          <w:tcPr>
+            <w:tcW w:type="dxa" w:w="2592"/>
+            <w:vAlign w:val="center"/>
+            <w:shd w:fill="D9EAF7"/>
+          </w:tcPr>
+          <w:p>
+            <w:pPr>
+              <w:spacing w:after="0"/>
+            </w:pPr>
+            <w:r/>
+            <w:r>
+              <w:rPr>
+                <w:rFonts w:ascii="Arial" w:hAnsi="Arial" w:eastAsia="Arial"/>
+                <w:b/>
+                <w:i w:val="0"/>
+                <w:color w:val="1F3864"/>
+                <w:sz w:val="17"/>
+              </w:rPr>
+              <w:t>Role / organization</w:t>
+            </w:r>
+          </w:p>
+        </w:tc>
+        <w:tc>
+          <w:tcPr>
+            <w:tcW w:type="dxa" w:w="2592"/>
+            <w:vAlign w:val="center"/>
+            <w:shd w:fill="D9EAF7"/>
+          </w:tcPr>
+          <w:p>
+            <w:pPr>
+              <w:spacing w:after="0"/>
+            </w:pPr>
+            <w:r/>
+            <w:r>
+              <w:rPr>
+                <w:rFonts w:ascii="Arial" w:hAnsi="Arial" w:eastAsia="Arial"/>
+                <w:b/>
+                <w:i w:val="0"/>
+                <w:color w:val="1F3864"/>
+                <w:sz w:val="17"/>
+              </w:rPr>
+              <w:t>Location</w:t>
+            </w:r>
+          </w:p>
+        </w:tc>
+        <w:tc>
+          <w:tcPr>
+            <w:tcW w:type="dxa" w:w="2592"/>
+            <w:vAlign w:val="center"/>
+            <w:shd w:fill="D9EAF7"/>
+          </w:tcPr>
+          <w:p>
+            <w:pPr>
+              <w:spacing w:after="0"/>
+            </w:pPr>
+            <w:r/>
+            <w:r>
+              <w:rPr>
+                <w:rFonts w:ascii="Arial" w:hAnsi="Arial" w:eastAsia="Arial"/>
+                <w:b/>
+                <w:i w:val="0"/>
+                <w:color w:val="1F3864"/>
+                <w:sz w:val="17"/>
+              </w:rPr>
+              <w:t>Description</w:t>
+            </w:r>
+          </w:p>
+        </w:tc>
+      </w:tr>
+      <w:tr>
+        <w:tc>
+          <w:tcPr>
+            <w:tcW w:type="dxa" w:w="2592"/>
+            <w:vAlign w:val="center"/>
+          </w:tcPr>
+          <w:p>
+            <w:pPr>
+              <w:spacing w:after="0"/>
+            </w:pPr>
+            <w:r/>
+            <w:r>
+              <w:rPr>
+                <w:rFonts w:ascii="Arial" w:hAnsi="Arial" w:eastAsia="Arial"/>
+                <w:b w:val="0"/>
+                <w:i w:val="0"/>
+                <w:sz w:val="17"/>
+              </w:rPr>
+              <w:t>2024 – Present</w:t>
+            </w:r>
+          </w:p>
+        </w:tc>
+        <w:tc>
+          <w:tcPr>
+            <w:tcW w:type="dxa" w:w="2592"/>
+            <w:vAlign w:val="center"/>
+          </w:tcPr>
+          <w:p>
+            <w:pPr>
+              <w:spacing w:after="0"/>
+            </w:pPr>
+            <w:r/>
+            <w:r>
+              <w:rPr>
+                <w:rFonts w:ascii="Arial" w:hAnsi="Arial" w:eastAsia="Arial"/>
+                <w:b w:val="0"/>
+                <w:i w:val="0"/>
+                <w:sz w:val="17"/>
+              </w:rPr>
+              <w:t>Research Fellow | Surgery Innovation Center · Mayo Clinic</w:t>
+            </w:r>
+          </w:p>
+        </w:tc>
+        <w:tc>
+          <w:tcPr>
+            <w:tcW w:type="dxa" w:w="2592"/>
+            <w:vAlign w:val="center"/>
+          </w:tcPr>
+          <w:p>
+            <w:pPr>
+              <w:spacing w:after="0"/>
+            </w:pPr>
+            <w:r/>
+            <w:r>
+              <w:rPr>
+                <w:rFonts w:ascii="Arial" w:hAnsi="Arial" w:eastAsia="Arial"/>
+                <w:b w:val="0"/>
+                <w:i w:val="0"/>
+                <w:sz w:val="17"/>
+              </w:rPr>
+              <w:t>Rochester, MN</w:t>
+            </w:r>
+          </w:p>
+        </w:tc>
+        <w:tc>
+          <w:tcPr>
+            <w:tcW w:type="dxa" w:w="2592"/>
+            <w:vAlign w:val="center"/>
+          </w:tcPr>
+          <w:p>
+            <w:pPr>
+              <w:spacing w:after="0"/>
+            </w:pPr>
+            <w:r/>
+            <w:r>
+              <w:rPr>
+                <w:rFonts w:ascii="Arial" w:hAnsi="Arial" w:eastAsia="Arial"/>
+                <w:b w:val="0"/>
+                <w:i w:val="0"/>
+                <w:sz w:val="17"/>
+              </w:rPr>
+            </w:r>
+          </w:p>
+        </w:tc>
+      </w:tr>
+      <w:tr>
+        <w:tc>
+          <w:tcPr>
+            <w:tcW w:type="dxa" w:w="2592"/>
+            <w:vAlign w:val="center"/>
+          </w:tcPr>
+          <w:p>
+            <w:pPr>
+              <w:spacing w:after="0"/>
+            </w:pPr>
+            <w:r/>
+            <w:r>
+              <w:rPr>
+                <w:rFonts w:ascii="Arial" w:hAnsi="Arial" w:eastAsia="Arial"/>
+                <w:b w:val="0"/>
+                <w:i w:val="0"/>
+                <w:sz w:val="17"/>
+              </w:rPr>
+              <w:t>2025 – Present</w:t>
+            </w:r>
+          </w:p>
+        </w:tc>
+        <w:tc>
+          <w:tcPr>
+            <w:tcW w:type="dxa" w:w="2592"/>
+            <w:vAlign w:val="center"/>
+          </w:tcPr>
+          <w:p>
+            <w:pPr>
+              <w:spacing w:after="0"/>
+            </w:pPr>
+            <w:r/>
+            <w:r>
+              <w:rPr>
+                <w:rFonts w:ascii="Arial" w:hAnsi="Arial" w:eastAsia="Arial"/>
+                <w:b w:val="0"/>
+                <w:i w:val="0"/>
+                <w:sz w:val="17"/>
+              </w:rPr>
+              <w:t>Research Fellow – A-Star Lab | Mayo Clinic</w:t>
+            </w:r>
+          </w:p>
+        </w:tc>
+        <w:tc>
+          <w:tcPr>
+            <w:tcW w:type="dxa" w:w="2592"/>
+            <w:vAlign w:val="center"/>
+          </w:tcPr>
+          <w:p>
+            <w:pPr>
+              <w:spacing w:after="0"/>
+            </w:pPr>
+            <w:r/>
+            <w:r>
+              <w:rPr>
+                <w:rFonts w:ascii="Arial" w:hAnsi="Arial" w:eastAsia="Arial"/>
+                <w:b w:val="0"/>
+                <w:i w:val="0"/>
+                <w:sz w:val="17"/>
+              </w:rPr>
+              <w:t>Rochester, MN, USA</w:t>
+            </w:r>
+          </w:p>
+        </w:tc>
+        <w:tc>
+          <w:tcPr>
+            <w:tcW w:type="dxa" w:w="2592"/>
+            <w:vAlign w:val="center"/>
+          </w:tcPr>
+          <w:p>
+            <w:pPr>
+              <w:spacing w:after="0"/>
+            </w:pPr>
+            <w:r/>
+            <w:r>
+              <w:rPr>
+                <w:rFonts w:ascii="Arial" w:hAnsi="Arial" w:eastAsia="Arial"/>
+                <w:b w:val="0"/>
+                <w:i w:val="0"/>
+                <w:sz w:val="17"/>
+              </w:rPr>
+            </w:r>
+          </w:p>
+        </w:tc>
+      </w:tr>
+      <w:tr>
+        <w:tc>
+          <w:tcPr>
+            <w:tcW w:type="dxa" w:w="2592"/>
+            <w:vAlign w:val="center"/>
+          </w:tcPr>
+          <w:p>
+            <w:pPr>
+              <w:spacing w:after="0"/>
+            </w:pPr>
+            <w:r/>
+            <w:r>
+              <w:rPr>
+                <w:rFonts w:ascii="Arial" w:hAnsi="Arial" w:eastAsia="Arial"/>
+                <w:b w:val="0"/>
+                <w:i w:val="0"/>
+                <w:sz w:val="17"/>
+              </w:rPr>
+              <w:t>2018 – 2024</w:t>
+            </w:r>
+          </w:p>
+        </w:tc>
+        <w:tc>
+          <w:tcPr>
+            <w:tcW w:type="dxa" w:w="2592"/>
+            <w:vAlign w:val="center"/>
+          </w:tcPr>
+          <w:p>
+            <w:pPr>
+              <w:spacing w:after="0"/>
+            </w:pPr>
+            <w:r/>
+            <w:r>
+              <w:rPr>
+                <w:rFonts w:ascii="Arial" w:hAnsi="Arial" w:eastAsia="Arial"/>
+                <w:b w:val="0"/>
+                <w:i w:val="0"/>
+                <w:sz w:val="17"/>
+              </w:rPr>
+              <w:t>Senior Researcher &amp; Project Manager | Thoracic &amp; Vascular Surgery Research Center · Shiraz University of Medical Sciences</w:t>
+            </w:r>
+          </w:p>
+        </w:tc>
+        <w:tc>
+          <w:tcPr>
+            <w:tcW w:type="dxa" w:w="2592"/>
+            <w:vAlign w:val="center"/>
+          </w:tcPr>
+          <w:p>
+            <w:pPr>
+              <w:spacing w:after="0"/>
+            </w:pPr>
+            <w:r/>
+            <w:r>
+              <w:rPr>
+                <w:rFonts w:ascii="Arial" w:hAnsi="Arial" w:eastAsia="Arial"/>
+                <w:b w:val="0"/>
+                <w:i w:val="0"/>
+                <w:sz w:val="17"/>
+              </w:rPr>
+              <w:t>Shiraz, Iran</w:t>
+            </w:r>
+          </w:p>
+        </w:tc>
+        <w:tc>
+          <w:tcPr>
+            <w:tcW w:type="dxa" w:w="2592"/>
+            <w:vAlign w:val="center"/>
+          </w:tcPr>
+          <w:p>
+            <w:pPr>
+              <w:spacing w:after="0"/>
+            </w:pPr>
+            <w:r/>
+            <w:r>
+              <w:rPr>
+                <w:rFonts w:ascii="Arial" w:hAnsi="Arial" w:eastAsia="Arial"/>
+                <w:b w:val="0"/>
+                <w:i w:val="0"/>
+                <w:sz w:val="17"/>
+              </w:rPr>
+            </w:r>
+          </w:p>
+        </w:tc>
+      </w:tr>
+      <w:tr>
+        <w:tc>
+          <w:tcPr>
+            <w:tcW w:type="dxa" w:w="2592"/>
+            <w:vAlign w:val="center"/>
+          </w:tcPr>
+          <w:p>
+            <w:pPr>
+              <w:spacing w:after="0"/>
+            </w:pPr>
+            <w:r/>
+            <w:r>
+              <w:rPr>
+                <w:rFonts w:ascii="Arial" w:hAnsi="Arial" w:eastAsia="Arial"/>
+                <w:b w:val="0"/>
+                <w:i w:val="0"/>
+                <w:sz w:val="17"/>
+              </w:rPr>
+              <w:t>2020 – 2022</w:t>
+            </w:r>
+          </w:p>
+        </w:tc>
+        <w:tc>
+          <w:tcPr>
+            <w:tcW w:type="dxa" w:w="2592"/>
+            <w:vAlign w:val="center"/>
+          </w:tcPr>
+          <w:p>
+            <w:pPr>
+              <w:spacing w:after="0"/>
+            </w:pPr>
+            <w:r/>
+            <w:r>
+              <w:rPr>
+                <w:rFonts w:ascii="Arial" w:hAnsi="Arial" w:eastAsia="Arial"/>
+                <w:b w:val="0"/>
+                <w:i w:val="0"/>
+                <w:sz w:val="17"/>
+              </w:rPr>
+              <w:t>General Practitioner — Emergency Department | Khatam-al-Anbiya Hospital</w:t>
+            </w:r>
+          </w:p>
+        </w:tc>
+        <w:tc>
+          <w:tcPr>
+            <w:tcW w:type="dxa" w:w="2592"/>
+            <w:vAlign w:val="center"/>
+          </w:tcPr>
+          <w:p>
+            <w:pPr>
+              <w:spacing w:after="0"/>
+            </w:pPr>
+            <w:r/>
+            <w:r>
+              <w:rPr>
+                <w:rFonts w:ascii="Arial" w:hAnsi="Arial" w:eastAsia="Arial"/>
+                <w:b w:val="0"/>
+                <w:i w:val="0"/>
+                <w:sz w:val="17"/>
+              </w:rPr>
+              <w:t>Bushehr, Iran</w:t>
+            </w:r>
+          </w:p>
+        </w:tc>
+        <w:tc>
+          <w:tcPr>
+            <w:tcW w:type="dxa" w:w="2592"/>
+            <w:vAlign w:val="center"/>
+          </w:tcPr>
+          <w:p>
+            <w:pPr>
+              <w:spacing w:after="0"/>
+            </w:pPr>
+            <w:r/>
+            <w:r>
+              <w:rPr>
+                <w:rFonts w:ascii="Arial" w:hAnsi="Arial" w:eastAsia="Arial"/>
+                <w:b w:val="0"/>
+                <w:i w:val="0"/>
+                <w:sz w:val="17"/>
+              </w:rPr>
+              <w:t>Ministry of Health mandatory medical service.</w:t>
+            </w:r>
+          </w:p>
+        </w:tc>
+      </w:tr>
+      <w:tr>
+        <w:tc>
+          <w:tcPr>
+            <w:tcW w:type="dxa" w:w="2592"/>
+            <w:vAlign w:val="center"/>
+          </w:tcPr>
+          <w:p>
+            <w:pPr>
+              <w:spacing w:after="0"/>
+            </w:pPr>
+            <w:r/>
+            <w:r>
+              <w:rPr>
+                <w:rFonts w:ascii="Arial" w:hAnsi="Arial" w:eastAsia="Arial"/>
+                <w:b w:val="0"/>
+                <w:i w:val="0"/>
+                <w:sz w:val="17"/>
+              </w:rPr>
+              <w:t>2014 – 2020</w:t>
+            </w:r>
+          </w:p>
+        </w:tc>
+        <w:tc>
+          <w:tcPr>
+            <w:tcW w:type="dxa" w:w="2592"/>
+            <w:vAlign w:val="center"/>
+          </w:tcPr>
+          <w:p>
+            <w:pPr>
+              <w:spacing w:after="0"/>
+            </w:pPr>
+            <w:r/>
+            <w:r>
+              <w:rPr>
+                <w:rFonts w:ascii="Arial" w:hAnsi="Arial" w:eastAsia="Arial"/>
+                <w:b w:val="0"/>
+                <w:i w:val="0"/>
+                <w:sz w:val="17"/>
+              </w:rPr>
+              <w:t>Research Trainee – Student Research Committee | Shiraz University of Medical Sciences</w:t>
+            </w:r>
+          </w:p>
+        </w:tc>
+        <w:tc>
+          <w:tcPr>
+            <w:tcW w:type="dxa" w:w="2592"/>
+            <w:vAlign w:val="center"/>
+          </w:tcPr>
+          <w:p>
+            <w:pPr>
+              <w:spacing w:after="0"/>
+            </w:pPr>
+            <w:r/>
+            <w:r>
+              <w:rPr>
+                <w:rFonts w:ascii="Arial" w:hAnsi="Arial" w:eastAsia="Arial"/>
+                <w:b w:val="0"/>
+                <w:i w:val="0"/>
+                <w:sz w:val="17"/>
+              </w:rPr>
+              <w:t>Shiraz, Iran</w:t>
+            </w:r>
+          </w:p>
+        </w:tc>
+        <w:tc>
+          <w:tcPr>
+            <w:tcW w:type="dxa" w:w="2592"/>
+            <w:vAlign w:val="center"/>
+          </w:tcPr>
+          <w:p>
+            <w:pPr>
+              <w:spacing w:after="0"/>
+            </w:pPr>
+            <w:r/>
+            <w:r>
+              <w:rPr>
+                <w:rFonts w:ascii="Arial" w:hAnsi="Arial" w:eastAsia="Arial"/>
+                <w:b w:val="0"/>
+                <w:i w:val="0"/>
+                <w:sz w:val="17"/>
+              </w:rPr>
+              <w:t>Participated in student-led clinical and translational research activities, including study design, data collection, manuscript preparation, and scientific collaboration.</w:t>
+            </w:r>
+          </w:p>
+        </w:tc>
+      </w:tr>
+    </w:tbl>
+    <w:p>
+      <w:pPr>
+        <w:spacing w:after="40" w:before="0"/>
+      </w:pPr>
+    </w:p>
+    <w:p>
+      <w:pPr>
+        <w:spacing w:before="180" w:after="60"/>
+        <w:pBdr>
+          <w:bottom w:val="single" w:sz="6" w:space="1" w:color="B8953A"/>
+        </w:pBdr>
+      </w:pPr>
+      <w:r>
+        <w:rPr>
+          <w:rFonts w:ascii="Arial" w:hAnsi="Arial" w:eastAsia="Arial"/>
+          <w:b/>
+          <w:i w:val="0"/>
+          <w:color w:val="1F3864"/>
+          <w:sz w:val="21"/>
+        </w:rPr>
+        <w:t>WORK AT MAYO CLINIC</w:t>
+      </w:r>
+    </w:p>
+    <w:p>
+      <w:pPr>
+        <w:spacing w:after="60" w:before="0"/>
+      </w:pPr>
+      <w:r>
+        <w:rPr>
+          <w:rFonts w:ascii="Arial" w:hAnsi="Arial" w:eastAsia="Arial"/>
+          <w:b w:val="0"/>
+          <w:i w:val="0"/>
+          <w:sz w:val="17"/>
+        </w:rPr>
+        <w:t>Dr. Shahriarirad is currently involved in approximately 40 active projects across the Department of Surgery, including around 25 projects in active phases such as patient recruitment, data collection, data analysis, and manuscript preparation, with additional projects pending IRB approval or resource allocation. His work involves collaboration across Mayo Clinic surgical innovation programs with Drs. Cornelius Thiels, Janani Reisenauer, Simon Laplante, Aparna Vijayasekaran, Kitty Wu, Arman Arghami, and John Nathan.</w:t>
+      </w:r>
+    </w:p>
+    <w:p>
+      <w:pPr>
+        <w:spacing w:after="60" w:before="0"/>
+      </w:pPr>
+      <w:r>
+        <w:rPr>
+          <w:rFonts w:ascii="Arial" w:hAnsi="Arial" w:eastAsia="Arial"/>
+          <w:b w:val="0"/>
+          <w:i w:val="0"/>
+          <w:sz w:val="17"/>
+        </w:rPr>
+        <w:t>His contributions vary by project and include study conceptualization and design, research question development, methodology planning, IRB preparation, data acquisition and curation, statistical analysis, manuscript drafting and editing, project coordination, operating-room device demonstrations, and patient recruitment.</w:t>
+      </w:r>
+    </w:p>
+    <w:p>
+      <w:pPr>
+        <w:spacing w:after="60" w:before="0"/>
+      </w:pPr>
+      <w:r>
+        <w:rPr>
+          <w:rFonts w:ascii="Arial" w:hAnsi="Arial" w:eastAsia="Arial"/>
+          <w:b w:val="0"/>
+          <w:i w:val="0"/>
+          <w:sz w:val="17"/>
+        </w:rPr>
+        <w:t>His collaborative technology and innovation work at Mayo Clinic spans surgical visualization, artificial intelligence, robotics, digital pathology, wearable monitoring, rehabilitation, and surgical education. These efforts include ApoQlar/Apple Vision Pro for real-time stereoscopic 3D robotic visualization; GoNoGoNET for AI-assisted surgical video analysis and safety-zone identification; ALARM/OmniWatch for wearable-based postoperative monitoring; JelloX for 3D digital pathology; INTERCEPTION and Alpenglow for robotic bronchoscopy, biopsy, and molecular sampling; CTA Perforator for computer vision-based reconstructive planning; ExerAI and Bioness for rehabilitation and gait assessment; bariatric surgery and ECG-based prediction models for precision surgical risk assessment; MOSI System for obesity staging and bariatric decision support; Lexo Drain for surgical device innovation; and robotic surgery curriculum development to improve resident training and educational quality.</w:t>
+      </w:r>
+    </w:p>
+    <w:p>
+      <w:pPr>
+        <w:spacing w:before="180" w:after="60"/>
+        <w:pBdr>
+          <w:bottom w:val="single" w:sz="6" w:space="1" w:color="B8953A"/>
+        </w:pBdr>
+      </w:pPr>
+      <w:r>
+        <w:rPr>
+          <w:rFonts w:ascii="Arial" w:hAnsi="Arial" w:eastAsia="Arial"/>
+          <w:b/>
+          <w:i w:val="0"/>
+          <w:color w:val="1F3864"/>
+          <w:sz w:val="21"/>
+        </w:rPr>
+        <w:t>AWARDS</w:t>
+      </w:r>
+    </w:p>
+    <w:tbl>
+      <w:tblPr>
+        <w:tblStyle w:val="TableGrid"/>
+        <w:tblW w:type="auto" w:w="0"/>
+        <w:jc w:val="left"/>
+        <w:tblLayout w:type="autofit"/>
+        <w:tblLook w:firstColumn="1" w:firstRow="1" w:lastColumn="0" w:lastRow="0" w:noHBand="0" w:noVBand="1" w:val="04A0"/>
+      </w:tblPr>
+      <w:tblGrid>
+        <w:gridCol w:w="3456"/>
+        <w:gridCol w:w="3456"/>
+        <w:gridCol w:w="3456"/>
+      </w:tblGrid>
+      <w:tr>
+        <w:tc>
+          <w:tcPr>
+            <w:tcW w:type="dxa" w:w="3456"/>
+            <w:vAlign w:val="center"/>
+            <w:shd w:fill="D9EAF7"/>
+          </w:tcPr>
+          <w:p>
+            <w:pPr>
+              <w:spacing w:after="0"/>
+            </w:pPr>
+            <w:r/>
+            <w:r>
+              <w:rPr>
+                <w:rFonts w:ascii="Arial" w:hAnsi="Arial" w:eastAsia="Arial"/>
+                <w:b/>
+                <w:i w:val="0"/>
+                <w:color w:val="1F3864"/>
+                <w:sz w:val="17"/>
+              </w:rPr>
+              <w:t>Year</w:t>
+            </w:r>
+          </w:p>
+        </w:tc>
+        <w:tc>
+          <w:tcPr>
+            <w:tcW w:type="dxa" w:w="3456"/>
+            <w:vAlign w:val="center"/>
+            <w:shd w:fill="D9EAF7"/>
+          </w:tcPr>
+          <w:p>
+            <w:pPr>
+              <w:spacing w:after="0"/>
+            </w:pPr>
+            <w:r/>
+            <w:r>
+              <w:rPr>
+                <w:rFonts w:ascii="Arial" w:hAnsi="Arial" w:eastAsia="Arial"/>
+                <w:b/>
+                <w:i w:val="0"/>
+                <w:color w:val="1F3864"/>
+                <w:sz w:val="17"/>
+              </w:rPr>
+              <w:t>Award</w:t>
+            </w:r>
+          </w:p>
+        </w:tc>
+        <w:tc>
+          <w:tcPr>
+            <w:tcW w:type="dxa" w:w="3456"/>
+            <w:vAlign w:val="center"/>
+            <w:shd w:fill="D9EAF7"/>
+          </w:tcPr>
+          <w:p>
+            <w:pPr>
+              <w:spacing w:after="0"/>
+            </w:pPr>
+            <w:r/>
+            <w:r>
+              <w:rPr>
+                <w:rFonts w:ascii="Arial" w:hAnsi="Arial" w:eastAsia="Arial"/>
+                <w:b/>
+                <w:i w:val="0"/>
+                <w:color w:val="1F3864"/>
+                <w:sz w:val="17"/>
+              </w:rPr>
+              <w:t>Organization</w:t>
+            </w:r>
+          </w:p>
+        </w:tc>
+      </w:tr>
+      <w:tr>
+        <w:tc>
+          <w:tcPr>
+            <w:tcW w:type="dxa" w:w="3456"/>
+            <w:vAlign w:val="center"/>
+          </w:tcPr>
+          <w:p>
+            <w:pPr>
+              <w:spacing w:after="0"/>
+            </w:pPr>
+            <w:r/>
+            <w:r>
+              <w:rPr>
+                <w:rFonts w:ascii="Arial" w:hAnsi="Arial" w:eastAsia="Arial"/>
+                <w:b w:val="0"/>
+                <w:i w:val="0"/>
+                <w:sz w:val="17"/>
+              </w:rPr>
+              <w:t>Dec 2023</w:t>
+            </w:r>
+          </w:p>
+        </w:tc>
+        <w:tc>
+          <w:tcPr>
+            <w:tcW w:type="dxa" w:w="3456"/>
+            <w:vAlign w:val="center"/>
+          </w:tcPr>
+          <w:p>
+            <w:pPr>
+              <w:spacing w:after="0"/>
+            </w:pPr>
+            <w:r/>
+            <w:r>
+              <w:rPr>
+                <w:rFonts w:ascii="Arial" w:hAnsi="Arial" w:eastAsia="Arial"/>
+                <w:b w:val="0"/>
+                <w:i w:val="0"/>
+                <w:sz w:val="17"/>
+              </w:rPr>
+              <w:t>World's Top 2% Scientists</w:t>
+            </w:r>
+          </w:p>
+        </w:tc>
+        <w:tc>
+          <w:tcPr>
+            <w:tcW w:type="dxa" w:w="3456"/>
+            <w:vAlign w:val="center"/>
+          </w:tcPr>
+          <w:p>
+            <w:pPr>
+              <w:spacing w:after="0"/>
+            </w:pPr>
+            <w:r/>
+            <w:r>
+              <w:rPr>
+                <w:rFonts w:ascii="Arial" w:hAnsi="Arial" w:eastAsia="Arial"/>
+                <w:b w:val="0"/>
+                <w:i w:val="0"/>
+                <w:sz w:val="17"/>
+              </w:rPr>
+              <w:t>Elsevier Data Repository / Stanford</w:t>
+            </w:r>
+          </w:p>
+        </w:tc>
+      </w:tr>
+      <w:tr>
+        <w:tc>
+          <w:tcPr>
+            <w:tcW w:type="dxa" w:w="3456"/>
+            <w:vAlign w:val="center"/>
+          </w:tcPr>
+          <w:p>
+            <w:pPr>
+              <w:spacing w:after="0"/>
+            </w:pPr>
+            <w:r/>
+            <w:r>
+              <w:rPr>
+                <w:rFonts w:ascii="Arial" w:hAnsi="Arial" w:eastAsia="Arial"/>
+                <w:b w:val="0"/>
+                <w:i w:val="0"/>
+                <w:sz w:val="17"/>
+              </w:rPr>
+              <w:t>Oct 2020</w:t>
+            </w:r>
+          </w:p>
+        </w:tc>
+        <w:tc>
+          <w:tcPr>
+            <w:tcW w:type="dxa" w:w="3456"/>
+            <w:vAlign w:val="center"/>
+          </w:tcPr>
+          <w:p>
+            <w:pPr>
+              <w:spacing w:after="0"/>
+            </w:pPr>
+            <w:r/>
+            <w:r>
+              <w:rPr>
+                <w:rFonts w:ascii="Arial" w:hAnsi="Arial" w:eastAsia="Arial"/>
+                <w:b w:val="0"/>
+                <w:i w:val="0"/>
+                <w:sz w:val="17"/>
+              </w:rPr>
+              <w:t>National Outstanding Student Researcher</w:t>
+            </w:r>
+          </w:p>
+        </w:tc>
+        <w:tc>
+          <w:tcPr>
+            <w:tcW w:type="dxa" w:w="3456"/>
+            <w:vAlign w:val="center"/>
+          </w:tcPr>
+          <w:p>
+            <w:pPr>
+              <w:spacing w:after="0"/>
+            </w:pPr>
+            <w:r/>
+            <w:r>
+              <w:rPr>
+                <w:rFonts w:ascii="Arial" w:hAnsi="Arial" w:eastAsia="Arial"/>
+                <w:b w:val="0"/>
+                <w:i w:val="0"/>
+                <w:sz w:val="17"/>
+              </w:rPr>
+              <w:t>Iran Ministry of Health and Medical Education</w:t>
+            </w:r>
+          </w:p>
+        </w:tc>
+      </w:tr>
+    </w:tbl>
+    <w:p>
+      <w:pPr>
+        <w:spacing w:after="40" w:before="0"/>
+      </w:pPr>
+    </w:p>
+    <w:p>
+      <w:pPr>
+        <w:spacing w:before="180" w:after="60"/>
+        <w:pBdr>
+          <w:bottom w:val="single" w:sz="6" w:space="1" w:color="B8953A"/>
+        </w:pBdr>
+      </w:pPr>
+      <w:r>
+        <w:rPr>
+          <w:rFonts w:ascii="Arial" w:hAnsi="Arial" w:eastAsia="Arial"/>
+          <w:b/>
+          <w:i w:val="0"/>
+          <w:color w:val="1F3864"/>
+          <w:sz w:val="21"/>
+        </w:rPr>
+        <w:t>LEADERSHIP &amp; COMMUNITY SERVICE</w:t>
+      </w:r>
+    </w:p>
+    <w:tbl>
+      <w:tblPr>
+        <w:tblStyle w:val="TableGrid"/>
+        <w:tblW w:type="auto" w:w="0"/>
+        <w:jc w:val="left"/>
+        <w:tblLayout w:type="autofit"/>
+        <w:tblLook w:firstColumn="1" w:firstRow="1" w:lastColumn="0" w:lastRow="0" w:noHBand="0" w:noVBand="1" w:val="04A0"/>
+      </w:tblPr>
+      <w:tblGrid>
+        <w:gridCol w:w="2592"/>
+        <w:gridCol w:w="2592"/>
+        <w:gridCol w:w="2592"/>
+        <w:gridCol w:w="2592"/>
+      </w:tblGrid>
+      <w:tr>
+        <w:tc>
+          <w:tcPr>
+            <w:tcW w:type="dxa" w:w="2592"/>
+            <w:vAlign w:val="center"/>
+            <w:shd w:fill="D9EAF7"/>
+          </w:tcPr>
+          <w:p>
+            <w:pPr>
+              <w:spacing w:after="0"/>
+            </w:pPr>
+            <w:r/>
+            <w:r>
+              <w:rPr>
+                <w:rFonts w:ascii="Arial" w:hAnsi="Arial" w:eastAsia="Arial"/>
+                <w:b/>
+                <w:i w:val="0"/>
+                <w:color w:val="1F3864"/>
+                <w:sz w:val="17"/>
+              </w:rPr>
+              <w:t>Period</w:t>
+            </w:r>
+          </w:p>
+        </w:tc>
+        <w:tc>
+          <w:tcPr>
+            <w:tcW w:type="dxa" w:w="2592"/>
+            <w:vAlign w:val="center"/>
+            <w:shd w:fill="D9EAF7"/>
+          </w:tcPr>
+          <w:p>
+            <w:pPr>
+              <w:spacing w:after="0"/>
+            </w:pPr>
+            <w:r/>
+            <w:r>
+              <w:rPr>
+                <w:rFonts w:ascii="Arial" w:hAnsi="Arial" w:eastAsia="Arial"/>
+                <w:b/>
+                <w:i w:val="0"/>
+                <w:color w:val="1F3864"/>
+                <w:sz w:val="17"/>
+              </w:rPr>
+              <w:t>Role</w:t>
+            </w:r>
+          </w:p>
+        </w:tc>
+        <w:tc>
+          <w:tcPr>
+            <w:tcW w:type="dxa" w:w="2592"/>
+            <w:vAlign w:val="center"/>
+            <w:shd w:fill="D9EAF7"/>
+          </w:tcPr>
+          <w:p>
+            <w:pPr>
+              <w:spacing w:after="0"/>
+            </w:pPr>
+            <w:r/>
+            <w:r>
+              <w:rPr>
+                <w:rFonts w:ascii="Arial" w:hAnsi="Arial" w:eastAsia="Arial"/>
+                <w:b/>
+                <w:i w:val="0"/>
+                <w:color w:val="1F3864"/>
+                <w:sz w:val="17"/>
+              </w:rPr>
+              <w:t>Organization</w:t>
+            </w:r>
+          </w:p>
+        </w:tc>
+        <w:tc>
+          <w:tcPr>
+            <w:tcW w:type="dxa" w:w="2592"/>
+            <w:vAlign w:val="center"/>
+            <w:shd w:fill="D9EAF7"/>
+          </w:tcPr>
+          <w:p>
+            <w:pPr>
+              <w:spacing w:after="0"/>
+            </w:pPr>
+            <w:r/>
+            <w:r>
+              <w:rPr>
+                <w:rFonts w:ascii="Arial" w:hAnsi="Arial" w:eastAsia="Arial"/>
+                <w:b/>
+                <w:i w:val="0"/>
+                <w:color w:val="1F3864"/>
+                <w:sz w:val="17"/>
+              </w:rPr>
+              <w:t>Description</w:t>
+            </w:r>
+          </w:p>
+        </w:tc>
+      </w:tr>
+      <w:tr>
+        <w:tc>
+          <w:tcPr>
+            <w:tcW w:type="dxa" w:w="2592"/>
+            <w:vAlign w:val="center"/>
+          </w:tcPr>
+          <w:p>
+            <w:pPr>
+              <w:spacing w:after="0"/>
+            </w:pPr>
+            <w:r/>
+            <w:r>
+              <w:rPr>
+                <w:rFonts w:ascii="Arial" w:hAnsi="Arial" w:eastAsia="Arial"/>
+                <w:b w:val="0"/>
+                <w:i w:val="0"/>
+                <w:sz w:val="17"/>
+              </w:rPr>
+              <w:t>2026 – Present</w:t>
+            </w:r>
+          </w:p>
+        </w:tc>
+        <w:tc>
+          <w:tcPr>
+            <w:tcW w:type="dxa" w:w="2592"/>
+            <w:vAlign w:val="center"/>
+          </w:tcPr>
+          <w:p>
+            <w:pPr>
+              <w:spacing w:after="0"/>
+            </w:pPr>
+            <w:r/>
+            <w:r>
+              <w:rPr>
+                <w:rFonts w:ascii="Arial" w:hAnsi="Arial" w:eastAsia="Arial"/>
+                <w:b w:val="0"/>
+                <w:i w:val="0"/>
+                <w:sz w:val="17"/>
+              </w:rPr>
+              <w:t>Mayo Fellow Association Quality Improvement Committee</w:t>
+            </w:r>
+          </w:p>
+        </w:tc>
+        <w:tc>
+          <w:tcPr>
+            <w:tcW w:type="dxa" w:w="2592"/>
+            <w:vAlign w:val="center"/>
+          </w:tcPr>
+          <w:p>
+            <w:pPr>
+              <w:spacing w:after="0"/>
+            </w:pPr>
+            <w:r/>
+            <w:r>
+              <w:rPr>
+                <w:rFonts w:ascii="Arial" w:hAnsi="Arial" w:eastAsia="Arial"/>
+                <w:b w:val="0"/>
+                <w:i w:val="0"/>
+                <w:sz w:val="17"/>
+              </w:rPr>
+              <w:t>Mayo Clinic, Rochester, MN</w:t>
+            </w:r>
+          </w:p>
+        </w:tc>
+        <w:tc>
+          <w:tcPr>
+            <w:tcW w:type="dxa" w:w="2592"/>
+            <w:vAlign w:val="center"/>
+          </w:tcPr>
+          <w:p>
+            <w:pPr>
+              <w:spacing w:after="0"/>
+            </w:pPr>
+            <w:r/>
+            <w:r>
+              <w:rPr>
+                <w:rFonts w:ascii="Arial" w:hAnsi="Arial" w:eastAsia="Arial"/>
+                <w:b w:val="0"/>
+                <w:i w:val="0"/>
+                <w:sz w:val="17"/>
+              </w:rPr>
+              <w:t>Contributes to quality improvement initiatives supporting research fellows and trainee experience at Mayo Clinic.</w:t>
+            </w:r>
+          </w:p>
+        </w:tc>
+      </w:tr>
+      <w:tr>
+        <w:tc>
+          <w:tcPr>
+            <w:tcW w:type="dxa" w:w="2592"/>
+            <w:vAlign w:val="center"/>
+          </w:tcPr>
+          <w:p>
+            <w:pPr>
+              <w:spacing w:after="0"/>
+            </w:pPr>
+            <w:r/>
+            <w:r>
+              <w:rPr>
+                <w:rFonts w:ascii="Arial" w:hAnsi="Arial" w:eastAsia="Arial"/>
+                <w:b w:val="0"/>
+                <w:i w:val="0"/>
+                <w:sz w:val="17"/>
+              </w:rPr>
+              <w:t>May 2026</w:t>
+            </w:r>
+          </w:p>
+        </w:tc>
+        <w:tc>
+          <w:tcPr>
+            <w:tcW w:type="dxa" w:w="2592"/>
+            <w:vAlign w:val="center"/>
+          </w:tcPr>
+          <w:p>
+            <w:pPr>
+              <w:spacing w:after="0"/>
+            </w:pPr>
+            <w:r/>
+            <w:r>
+              <w:rPr>
+                <w:rFonts w:ascii="Arial" w:hAnsi="Arial" w:eastAsia="Arial"/>
+                <w:b w:val="0"/>
+                <w:i w:val="0"/>
+                <w:sz w:val="17"/>
+              </w:rPr>
+              <w:t>Trauma Center Injury Prevention – Bike Rodeo / Bike Safety Program</w:t>
+            </w:r>
+          </w:p>
+        </w:tc>
+        <w:tc>
+          <w:tcPr>
+            <w:tcW w:type="dxa" w:w="2592"/>
+            <w:vAlign w:val="center"/>
+          </w:tcPr>
+          <w:p>
+            <w:pPr>
+              <w:spacing w:after="0"/>
+            </w:pPr>
+            <w:r/>
+            <w:r>
+              <w:rPr>
+                <w:rFonts w:ascii="Arial" w:hAnsi="Arial" w:eastAsia="Arial"/>
+                <w:b w:val="0"/>
+                <w:i w:val="0"/>
+                <w:sz w:val="17"/>
+              </w:rPr>
+              <w:t>Rochester, MN</w:t>
+            </w:r>
+          </w:p>
+        </w:tc>
+        <w:tc>
+          <w:tcPr>
+            <w:tcW w:type="dxa" w:w="2592"/>
+            <w:vAlign w:val="center"/>
+          </w:tcPr>
+          <w:p>
+            <w:pPr>
+              <w:spacing w:after="0"/>
+            </w:pPr>
+            <w:r/>
+            <w:r>
+              <w:rPr>
+                <w:rFonts w:ascii="Arial" w:hAnsi="Arial" w:eastAsia="Arial"/>
+                <w:b w:val="0"/>
+                <w:i w:val="0"/>
+                <w:sz w:val="17"/>
+              </w:rPr>
+              <w:t>Participated in a community injury-prevention and bike-safety program focused on education and safety awareness.</w:t>
+            </w:r>
+          </w:p>
+        </w:tc>
+      </w:tr>
+      <w:tr>
+        <w:tc>
+          <w:tcPr>
+            <w:tcW w:type="dxa" w:w="2592"/>
+            <w:vAlign w:val="center"/>
+          </w:tcPr>
+          <w:p>
+            <w:pPr>
+              <w:spacing w:after="0"/>
+            </w:pPr>
+            <w:r/>
+            <w:r>
+              <w:rPr>
+                <w:rFonts w:ascii="Arial" w:hAnsi="Arial" w:eastAsia="Arial"/>
+                <w:b w:val="0"/>
+                <w:i w:val="0"/>
+                <w:sz w:val="17"/>
+              </w:rPr>
+              <w:t>2026 – Present</w:t>
+            </w:r>
+          </w:p>
+        </w:tc>
+        <w:tc>
+          <w:tcPr>
+            <w:tcW w:type="dxa" w:w="2592"/>
+            <w:vAlign w:val="center"/>
+          </w:tcPr>
+          <w:p>
+            <w:pPr>
+              <w:spacing w:after="0"/>
+            </w:pPr>
+            <w:r/>
+            <w:r>
+              <w:rPr>
+                <w:rFonts w:ascii="Arial" w:hAnsi="Arial" w:eastAsia="Arial"/>
+                <w:b w:val="0"/>
+                <w:i w:val="0"/>
+                <w:sz w:val="17"/>
+              </w:rPr>
+              <w:t>MRFA Mentor-Mentee Program</w:t>
+            </w:r>
+          </w:p>
+        </w:tc>
+        <w:tc>
+          <w:tcPr>
+            <w:tcW w:type="dxa" w:w="2592"/>
+            <w:vAlign w:val="center"/>
+          </w:tcPr>
+          <w:p>
+            <w:pPr>
+              <w:spacing w:after="0"/>
+            </w:pPr>
+            <w:r/>
+            <w:r>
+              <w:rPr>
+                <w:rFonts w:ascii="Arial" w:hAnsi="Arial" w:eastAsia="Arial"/>
+                <w:b w:val="0"/>
+                <w:i w:val="0"/>
+                <w:sz w:val="17"/>
+              </w:rPr>
+              <w:t>Mayo Clinic, Rochester, MN</w:t>
+            </w:r>
+          </w:p>
+        </w:tc>
+        <w:tc>
+          <w:tcPr>
+            <w:tcW w:type="dxa" w:w="2592"/>
+            <w:vAlign w:val="center"/>
+          </w:tcPr>
+          <w:p>
+            <w:pPr>
+              <w:spacing w:after="0"/>
+            </w:pPr>
+            <w:r/>
+            <w:r>
+              <w:rPr>
+                <w:rFonts w:ascii="Arial" w:hAnsi="Arial" w:eastAsia="Arial"/>
+                <w:b w:val="0"/>
+                <w:i w:val="0"/>
+                <w:sz w:val="17"/>
+              </w:rPr>
+              <w:t>Supports mentorship and professional development for research fellows through the MRFA mentor-mentee program.</w:t>
+            </w:r>
+          </w:p>
+        </w:tc>
+      </w:tr>
+      <w:tr>
+        <w:tc>
+          <w:tcPr>
+            <w:tcW w:type="dxa" w:w="2592"/>
+            <w:vAlign w:val="center"/>
+          </w:tcPr>
+          <w:p>
+            <w:pPr>
+              <w:spacing w:after="0"/>
+            </w:pPr>
+            <w:r/>
+            <w:r>
+              <w:rPr>
+                <w:rFonts w:ascii="Arial" w:hAnsi="Arial" w:eastAsia="Arial"/>
+                <w:b w:val="0"/>
+                <w:i w:val="0"/>
+                <w:sz w:val="17"/>
+              </w:rPr>
+              <w:t>2024 – Present</w:t>
+            </w:r>
+          </w:p>
+        </w:tc>
+        <w:tc>
+          <w:tcPr>
+            <w:tcW w:type="dxa" w:w="2592"/>
+            <w:vAlign w:val="center"/>
+          </w:tcPr>
+          <w:p>
+            <w:pPr>
+              <w:spacing w:after="0"/>
+            </w:pPr>
+            <w:r/>
+            <w:r>
+              <w:rPr>
+                <w:rFonts w:ascii="Arial" w:hAnsi="Arial" w:eastAsia="Arial"/>
+                <w:b w:val="0"/>
+                <w:i w:val="0"/>
+                <w:sz w:val="17"/>
+              </w:rPr>
+              <w:t>Oraculi STEM Mentor – John Adams Middle School Science Fair</w:t>
+            </w:r>
+          </w:p>
+        </w:tc>
+        <w:tc>
+          <w:tcPr>
+            <w:tcW w:type="dxa" w:w="2592"/>
+            <w:vAlign w:val="center"/>
+          </w:tcPr>
+          <w:p>
+            <w:pPr>
+              <w:spacing w:after="0"/>
+            </w:pPr>
+            <w:r/>
+            <w:r>
+              <w:rPr>
+                <w:rFonts w:ascii="Arial" w:hAnsi="Arial" w:eastAsia="Arial"/>
+                <w:b w:val="0"/>
+                <w:i w:val="0"/>
+                <w:sz w:val="17"/>
+              </w:rPr>
+              <w:t>Rochester, MN</w:t>
+            </w:r>
+          </w:p>
+        </w:tc>
+        <w:tc>
+          <w:tcPr>
+            <w:tcW w:type="dxa" w:w="2592"/>
+            <w:vAlign w:val="center"/>
+          </w:tcPr>
+          <w:p>
+            <w:pPr>
+              <w:spacing w:after="0"/>
+            </w:pPr>
+            <w:r/>
+            <w:r>
+              <w:rPr>
+                <w:rFonts w:ascii="Arial" w:hAnsi="Arial" w:eastAsia="Arial"/>
+                <w:b w:val="0"/>
+                <w:i w:val="0"/>
+                <w:sz w:val="17"/>
+              </w:rPr>
+              <w:t>Mentors students through STEM and science-fair activities, supporting early exposure to scientific thinking and research methods.</w:t>
+            </w:r>
+          </w:p>
+        </w:tc>
+      </w:tr>
+      <w:tr>
+        <w:tc>
+          <w:tcPr>
+            <w:tcW w:type="dxa" w:w="2592"/>
+            <w:vAlign w:val="center"/>
+          </w:tcPr>
+          <w:p>
+            <w:pPr>
+              <w:spacing w:after="0"/>
+            </w:pPr>
+            <w:r/>
+            <w:r>
+              <w:rPr>
+                <w:rFonts w:ascii="Arial" w:hAnsi="Arial" w:eastAsia="Arial"/>
+                <w:b w:val="0"/>
+                <w:i w:val="0"/>
+                <w:sz w:val="17"/>
+              </w:rPr>
+              <w:t>2020 – Present</w:t>
+            </w:r>
+          </w:p>
+        </w:tc>
+        <w:tc>
+          <w:tcPr>
+            <w:tcW w:type="dxa" w:w="2592"/>
+            <w:vAlign w:val="center"/>
+          </w:tcPr>
+          <w:p>
+            <w:pPr>
+              <w:spacing w:after="0"/>
+            </w:pPr>
+            <w:r/>
+            <w:r>
+              <w:rPr>
+                <w:rFonts w:ascii="Arial" w:hAnsi="Arial" w:eastAsia="Arial"/>
+                <w:b w:val="0"/>
+                <w:i w:val="0"/>
+                <w:sz w:val="17"/>
+              </w:rPr>
+              <w:t>Research Project Manager and Mentoring Program</w:t>
+            </w:r>
+          </w:p>
+        </w:tc>
+        <w:tc>
+          <w:tcPr>
+            <w:tcW w:type="dxa" w:w="2592"/>
+            <w:vAlign w:val="center"/>
+          </w:tcPr>
+          <w:p>
+            <w:pPr>
+              <w:spacing w:after="0"/>
+            </w:pPr>
+            <w:r/>
+            <w:r>
+              <w:rPr>
+                <w:rFonts w:ascii="Arial" w:hAnsi="Arial" w:eastAsia="Arial"/>
+                <w:b w:val="0"/>
+                <w:i w:val="0"/>
+                <w:sz w:val="17"/>
+              </w:rPr>
+              <w:t>Thoracic and Vascular Surgery Research Center, Shiraz University of Medical Sciences, Shiraz, Iran</w:t>
+            </w:r>
+          </w:p>
+        </w:tc>
+        <w:tc>
+          <w:tcPr>
+            <w:tcW w:type="dxa" w:w="2592"/>
+            <w:vAlign w:val="center"/>
+          </w:tcPr>
+          <w:p>
+            <w:pPr>
+              <w:spacing w:after="0"/>
+            </w:pPr>
+            <w:r/>
+            <w:r>
+              <w:rPr>
+                <w:rFonts w:ascii="Arial" w:hAnsi="Arial" w:eastAsia="Arial"/>
+                <w:b w:val="0"/>
+                <w:i w:val="0"/>
+                <w:sz w:val="17"/>
+              </w:rPr>
+              <w:t>Founded and directed a research mentoring program at the Thoracic and Vascular Surgery Research Center, mentoring 15 medical students in research methodology, scientific writing, and publication strategy, with participating students contributing to more than 50 peer-reviewed publications.</w:t>
+            </w:r>
+          </w:p>
+        </w:tc>
+      </w:tr>
+    </w:tbl>
+    <w:p>
+      <w:pPr>
+        <w:spacing w:after="40" w:before="0"/>
+      </w:pPr>
+    </w:p>
+    <w:p>
+      <w:pPr>
+        <w:spacing w:before="180" w:after="60"/>
+        <w:pBdr>
+          <w:bottom w:val="single" w:sz="6" w:space="1" w:color="B8953A"/>
+        </w:pBdr>
+      </w:pPr>
+      <w:r>
+        <w:rPr>
+          <w:rFonts w:ascii="Arial" w:hAnsi="Arial" w:eastAsia="Arial"/>
+          <w:b/>
+          <w:i w:val="0"/>
+          <w:color w:val="1F3864"/>
+          <w:sz w:val="21"/>
+        </w:rPr>
+        <w:t>SKILLS</w:t>
+      </w:r>
+    </w:p>
+    <w:tbl>
+      <w:tblPr>
+        <w:tblStyle w:val="TableGrid"/>
+        <w:tblW w:type="auto" w:w="0"/>
+        <w:jc w:val="left"/>
+        <w:tblLayout w:type="autofit"/>
+        <w:tblLook w:firstColumn="1" w:firstRow="1" w:lastColumn="0" w:lastRow="0" w:noHBand="0" w:noVBand="1" w:val="04A0"/>
+      </w:tblPr>
+      <w:tblGrid>
+        <w:gridCol w:w="5184"/>
+        <w:gridCol w:w="5184"/>
+      </w:tblGrid>
+      <w:tr>
+        <w:tc>
+          <w:tcPr>
+            <w:tcW w:type="dxa" w:w="2448"/>
+            <w:vAlign w:val="center"/>
+          </w:tcPr>
+          <w:p>
+            <w:pPr>
+              <w:spacing w:after="0"/>
+            </w:pPr>
+            <w:r/>
+            <w:r>
+              <w:rPr>
+                <w:rFonts w:ascii="Arial" w:hAnsi="Arial" w:eastAsia="Arial"/>
+                <w:b w:val="0"/>
+                <w:i w:val="0"/>
+                <w:sz w:val="17"/>
+              </w:rPr>
+              <w:t>Technical &amp; Software</w:t>
+            </w:r>
+          </w:p>
+        </w:tc>
+        <w:tc>
+          <w:tcPr>
+            <w:tcW w:type="dxa" w:w="7056"/>
+            <w:vAlign w:val="center"/>
+          </w:tcPr>
+          <w:p>
+            <w:pPr>
+              <w:spacing w:after="0"/>
+            </w:pPr>
+            <w:r/>
+            <w:r>
+              <w:rPr>
+                <w:rFonts w:ascii="Arial" w:hAnsi="Arial" w:eastAsia="Arial"/>
+                <w:b w:val="0"/>
+                <w:i w:val="0"/>
+                <w:sz w:val="17"/>
+              </w:rPr>
+              <w:t>SPSS (Good); EndNote (Good); Microsoft Office (Good); Corel Video Studio (Good); Python (Beginner); MATLAB (Beginner); NCSS (Beginner); Azure DevOps (Beginner); Typing (90 wpm)</w:t>
+            </w:r>
+          </w:p>
+        </w:tc>
+      </w:tr>
+      <w:tr>
+        <w:tc>
+          <w:tcPr>
+            <w:tcW w:type="dxa" w:w="2448"/>
+            <w:vAlign w:val="center"/>
+          </w:tcPr>
+          <w:p>
+            <w:pPr>
+              <w:spacing w:after="0"/>
+            </w:pPr>
+            <w:r/>
+            <w:r>
+              <w:rPr>
+                <w:rFonts w:ascii="Arial" w:hAnsi="Arial" w:eastAsia="Arial"/>
+                <w:b w:val="0"/>
+                <w:i w:val="0"/>
+                <w:sz w:val="17"/>
+              </w:rPr>
+              <w:t>Research &amp; Analytical</w:t>
+            </w:r>
+          </w:p>
+        </w:tc>
+        <w:tc>
+          <w:tcPr>
+            <w:tcW w:type="dxa" w:w="7056"/>
+            <w:vAlign w:val="center"/>
+          </w:tcPr>
+          <w:p>
+            <w:pPr>
+              <w:spacing w:after="0"/>
+            </w:pPr>
+            <w:r/>
+            <w:r>
+              <w:rPr>
+                <w:rFonts w:ascii="Arial" w:hAnsi="Arial" w:eastAsia="Arial"/>
+                <w:b w:val="0"/>
+                <w:i w:val="0"/>
+                <w:sz w:val="17"/>
+              </w:rPr>
+              <w:t>Study design; RCT coordination; Data management; Statistical analysis; Systematic review and meta-analysis; Clinical research coordination; IRB preparation</w:t>
+            </w:r>
+          </w:p>
+        </w:tc>
+      </w:tr>
+      <w:tr>
+        <w:tc>
+          <w:tcPr>
+            <w:tcW w:type="dxa" w:w="2448"/>
+            <w:vAlign w:val="center"/>
+          </w:tcPr>
+          <w:p>
+            <w:pPr>
+              <w:spacing w:after="0"/>
+            </w:pPr>
+            <w:r/>
+            <w:r>
+              <w:rPr>
+                <w:rFonts w:ascii="Arial" w:hAnsi="Arial" w:eastAsia="Arial"/>
+                <w:b w:val="0"/>
+                <w:i w:val="0"/>
+                <w:sz w:val="17"/>
+              </w:rPr>
+              <w:t>Interpersonal</w:t>
+            </w:r>
+          </w:p>
+        </w:tc>
+        <w:tc>
+          <w:tcPr>
+            <w:tcW w:type="dxa" w:w="7056"/>
+            <w:vAlign w:val="center"/>
+          </w:tcPr>
+          <w:p>
+            <w:pPr>
+              <w:spacing w:after="0"/>
+            </w:pPr>
+            <w:r/>
+            <w:r>
+              <w:rPr>
+                <w:rFonts w:ascii="Arial" w:hAnsi="Arial" w:eastAsia="Arial"/>
+                <w:b w:val="0"/>
+                <w:i w:val="0"/>
+                <w:sz w:val="17"/>
+              </w:rPr>
+              <w:t>Scientific editing; Presentation skills; Mentoring; Time management; Multidisciplinary collaboration; English and Farsi fluency</w:t>
+            </w:r>
+          </w:p>
+        </w:tc>
+      </w:tr>
+    </w:tbl>
+    <w:p>
+      <w:pPr>
+        <w:spacing w:after="40" w:before="0"/>
+      </w:pPr>
+    </w:p>
+    <w:p>
+      <w:pPr>
+        <w:spacing w:before="180" w:after="60"/>
+        <w:pBdr>
+          <w:bottom w:val="single" w:sz="6" w:space="1" w:color="B8953A"/>
+        </w:pBdr>
+      </w:pPr>
+      <w:r>
+        <w:rPr>
+          <w:rFonts w:ascii="Arial" w:hAnsi="Arial" w:eastAsia="Arial"/>
+          <w:b/>
+          <w:i w:val="0"/>
+          <w:color w:val="1F3864"/>
+          <w:sz w:val="21"/>
+        </w:rPr>
+        <w:t>PATENTS AND INNOVATIONS</w:t>
+      </w:r>
+    </w:p>
+    <w:tbl>
+      <w:tblPr>
+        <w:tblStyle w:val="TableGrid"/>
+        <w:tblW w:type="auto" w:w="0"/>
+        <w:jc w:val="left"/>
+        <w:tblLayout w:type="autofit"/>
+        <w:tblLook w:firstColumn="1" w:firstRow="1" w:lastColumn="0" w:lastRow="0" w:noHBand="0" w:noVBand="1" w:val="04A0"/>
+      </w:tblPr>
+      <w:tblGrid>
+        <w:gridCol w:w="2592"/>
+        <w:gridCol w:w="2592"/>
+        <w:gridCol w:w="2592"/>
+        <w:gridCol w:w="2592"/>
+      </w:tblGrid>
+      <w:tr>
+        <w:tc>
+          <w:tcPr>
+            <w:tcW w:type="dxa" w:w="2592"/>
+            <w:vAlign w:val="center"/>
+            <w:shd w:fill="D9EAF7"/>
+          </w:tcPr>
+          <w:p>
+            <w:pPr>
+              <w:spacing w:after="0"/>
+            </w:pPr>
+            <w:r/>
+            <w:r>
+              <w:rPr>
+                <w:rFonts w:ascii="Arial" w:hAnsi="Arial" w:eastAsia="Arial"/>
+                <w:b/>
+                <w:i w:val="0"/>
+                <w:color w:val="1F3864"/>
+                <w:sz w:val="17"/>
+              </w:rPr>
+              <w:t>Date</w:t>
+            </w:r>
+          </w:p>
+        </w:tc>
+        <w:tc>
+          <w:tcPr>
+            <w:tcW w:type="dxa" w:w="2592"/>
+            <w:vAlign w:val="center"/>
+            <w:shd w:fill="D9EAF7"/>
+          </w:tcPr>
+          <w:p>
+            <w:pPr>
+              <w:spacing w:after="0"/>
+            </w:pPr>
+            <w:r/>
+            <w:r>
+              <w:rPr>
+                <w:rFonts w:ascii="Arial" w:hAnsi="Arial" w:eastAsia="Arial"/>
+                <w:b/>
+                <w:i w:val="0"/>
+                <w:color w:val="1F3864"/>
+                <w:sz w:val="17"/>
+              </w:rPr>
+              <w:t>Title</w:t>
+            </w:r>
+          </w:p>
+        </w:tc>
+        <w:tc>
+          <w:tcPr>
+            <w:tcW w:type="dxa" w:w="2592"/>
+            <w:vAlign w:val="center"/>
+            <w:shd w:fill="D9EAF7"/>
+          </w:tcPr>
+          <w:p>
+            <w:pPr>
+              <w:spacing w:after="0"/>
+            </w:pPr>
+            <w:r/>
+            <w:r>
+              <w:rPr>
+                <w:rFonts w:ascii="Arial" w:hAnsi="Arial" w:eastAsia="Arial"/>
+                <w:b/>
+                <w:i w:val="0"/>
+                <w:color w:val="1F3864"/>
+                <w:sz w:val="17"/>
+              </w:rPr>
+              <w:t>Issuer</w:t>
+            </w:r>
+          </w:p>
+        </w:tc>
+        <w:tc>
+          <w:tcPr>
+            <w:tcW w:type="dxa" w:w="2592"/>
+            <w:vAlign w:val="center"/>
+            <w:shd w:fill="D9EAF7"/>
+          </w:tcPr>
+          <w:p>
+            <w:pPr>
+              <w:spacing w:after="0"/>
+            </w:pPr>
+            <w:r/>
+            <w:r>
+              <w:rPr>
+                <w:rFonts w:ascii="Arial" w:hAnsi="Arial" w:eastAsia="Arial"/>
+                <w:b/>
+                <w:i w:val="0"/>
+                <w:color w:val="1F3864"/>
+                <w:sz w:val="17"/>
+              </w:rPr>
+              <w:t>Number</w:t>
+            </w:r>
+          </w:p>
+        </w:tc>
+      </w:tr>
+      <w:tr>
+        <w:tc>
+          <w:tcPr>
+            <w:tcW w:type="dxa" w:w="2592"/>
+            <w:vAlign w:val="center"/>
+          </w:tcPr>
+          <w:p>
+            <w:pPr>
+              <w:spacing w:after="0"/>
+            </w:pPr>
+            <w:r/>
+            <w:r>
+              <w:rPr>
+                <w:rFonts w:ascii="Arial" w:hAnsi="Arial" w:eastAsia="Arial"/>
+                <w:b w:val="0"/>
+                <w:i w:val="0"/>
+                <w:sz w:val="17"/>
+              </w:rPr>
+              <w:t>Apr 2021</w:t>
+            </w:r>
+          </w:p>
+        </w:tc>
+        <w:tc>
+          <w:tcPr>
+            <w:tcW w:type="dxa" w:w="2592"/>
+            <w:vAlign w:val="center"/>
+          </w:tcPr>
+          <w:p>
+            <w:pPr>
+              <w:spacing w:after="0"/>
+            </w:pPr>
+            <w:r/>
+            <w:r>
+              <w:rPr>
+                <w:rFonts w:ascii="Arial" w:hAnsi="Arial" w:eastAsia="Arial"/>
+                <w:b w:val="0"/>
+                <w:i w:val="0"/>
+                <w:sz w:val="17"/>
+              </w:rPr>
+              <w:t>A Machine Learning-Based System for Detecting Leishmaniasis in Microscopic Images</w:t>
+            </w:r>
+          </w:p>
+        </w:tc>
+        <w:tc>
+          <w:tcPr>
+            <w:tcW w:type="dxa" w:w="2592"/>
+            <w:vAlign w:val="center"/>
+          </w:tcPr>
+          <w:p>
+            <w:pPr>
+              <w:spacing w:after="0"/>
+            </w:pPr>
+            <w:r/>
+            <w:r>
+              <w:rPr>
+                <w:rFonts w:ascii="Arial" w:hAnsi="Arial" w:eastAsia="Arial"/>
+                <w:b w:val="0"/>
+                <w:i w:val="0"/>
+                <w:sz w:val="17"/>
+              </w:rPr>
+              <w:t>IR</w:t>
+            </w:r>
+          </w:p>
+        </w:tc>
+        <w:tc>
+          <w:tcPr>
+            <w:tcW w:type="dxa" w:w="2592"/>
+            <w:vAlign w:val="center"/>
+          </w:tcPr>
+          <w:p>
+            <w:pPr>
+              <w:spacing w:after="0"/>
+            </w:pPr>
+            <w:r/>
+            <w:r>
+              <w:rPr>
+                <w:rFonts w:ascii="Arial" w:hAnsi="Arial" w:eastAsia="Arial"/>
+                <w:b w:val="0"/>
+                <w:i w:val="0"/>
+                <w:sz w:val="17"/>
+              </w:rPr>
+              <w:t>140050140003000416</w:t>
+            </w:r>
+          </w:p>
+        </w:tc>
+      </w:tr>
+      <w:tr>
+        <w:tc>
+          <w:tcPr>
+            <w:tcW w:type="dxa" w:w="2592"/>
+            <w:vAlign w:val="center"/>
+          </w:tcPr>
+          <w:p>
+            <w:pPr>
+              <w:spacing w:after="0"/>
+            </w:pPr>
+            <w:r/>
+            <w:r>
+              <w:rPr>
+                <w:rFonts w:ascii="Arial" w:hAnsi="Arial" w:eastAsia="Arial"/>
+                <w:b w:val="0"/>
+                <w:i w:val="0"/>
+                <w:sz w:val="17"/>
+              </w:rPr>
+              <w:t>Oct 2020</w:t>
+            </w:r>
+          </w:p>
+        </w:tc>
+        <w:tc>
+          <w:tcPr>
+            <w:tcW w:type="dxa" w:w="2592"/>
+            <w:vAlign w:val="center"/>
+          </w:tcPr>
+          <w:p>
+            <w:pPr>
+              <w:spacing w:after="0"/>
+            </w:pPr>
+            <w:r/>
+            <w:r>
+              <w:rPr>
+                <w:rFonts w:ascii="Arial" w:hAnsi="Arial" w:eastAsia="Arial"/>
+                <w:b w:val="0"/>
+                <w:i w:val="0"/>
+                <w:sz w:val="17"/>
+              </w:rPr>
+              <w:t>Utilization of Chest Tube in Pediatric Caustic Injuries: A New Method for Esophageal Stenting</w:t>
+            </w:r>
+          </w:p>
+        </w:tc>
+        <w:tc>
+          <w:tcPr>
+            <w:tcW w:type="dxa" w:w="2592"/>
+            <w:vAlign w:val="center"/>
+          </w:tcPr>
+          <w:p>
+            <w:pPr>
+              <w:spacing w:after="0"/>
+            </w:pPr>
+            <w:r/>
+            <w:r>
+              <w:rPr>
+                <w:rFonts w:ascii="Arial" w:hAnsi="Arial" w:eastAsia="Arial"/>
+                <w:b w:val="0"/>
+                <w:i w:val="0"/>
+                <w:sz w:val="17"/>
+              </w:rPr>
+              <w:t>IR</w:t>
+            </w:r>
+          </w:p>
+        </w:tc>
+        <w:tc>
+          <w:tcPr>
+            <w:tcW w:type="dxa" w:w="2592"/>
+            <w:vAlign w:val="center"/>
+          </w:tcPr>
+          <w:p>
+            <w:pPr>
+              <w:spacing w:after="0"/>
+            </w:pPr>
+            <w:r/>
+            <w:r>
+              <w:rPr>
+                <w:rFonts w:ascii="Arial" w:hAnsi="Arial" w:eastAsia="Arial"/>
+                <w:b w:val="0"/>
+                <w:i w:val="0"/>
+                <w:sz w:val="17"/>
+              </w:rPr>
+              <w:t>139950140003006653</w:t>
             </w:r>
           </w:p>
         </w:tc>

</xml_diff>

<commit_message>
Add two Balfour Symposium Posters of Distinction (Oct 2026)
Two more posters for the 32nd Annual Balfour Surgery Research Symposium
(Oct 2026, United States), both selected as Posters of Distinction — noted as
"· Poster of Distinction" after the conference name on each card:
- The Mayo Obesity Staging Index (MOSI): Development of a Staging Framework for
  Metabolic Surgery (Bariatric)
- Metabolic Surgery Improves Biological Aging as Assessed by AI-Derived
  Electrocardiogram Age (Bariatric + Machine learning)

Presentations now total 27. Verified: validate + build + smoke pass; in-browser
both render with the distinction note, filters pass, no page errors.

Co-Authored-By: Claude Fable 5 <noreply@anthropic.com>
Claude-Session: https://claude.ai/code/session_01Mvoqy98ifTezCDCHR5sSsp
</commit_message>
<xml_diff>
--- a/Shahriarirad_Reza_CV.docx
+++ b/Shahriarirad_Reza_CV.docx
@@ -3355,7 +3355,7 @@
                 <w:i w:val="0"/>
                 <w:sz w:val="17"/>
               </w:rPr>
-              <w:t>25</w:t>
+              <w:t>27</w:t>
             </w:r>
           </w:p>
         </w:tc>
@@ -3399,7 +3399,7 @@
                 <w:i w:val="0"/>
                 <w:sz w:val="17"/>
               </w:rPr>
-              <w:t>23</w:t>
+              <w:t>25</w:t>
             </w:r>
           </w:p>
         </w:tc>
@@ -22083,6 +22083,220 @@
           </w:p>
         </w:tc>
       </w:tr>
+      <w:tr>
+        <w:tc>
+          <w:tcPr>
+            <w:tcW w:type="dxa" w:w="504"/>
+            <w:vAlign w:val="center"/>
+          </w:tcPr>
+          <w:p>
+            <w:pPr>
+              <w:spacing w:after="0"/>
+            </w:pPr>
+            <w:r/>
+            <w:r>
+              <w:rPr>
+                <w:rFonts w:ascii="Arial" w:hAnsi="Arial" w:eastAsia="Arial"/>
+                <w:b w:val="0"/>
+                <w:i w:val="0"/>
+                <w:sz w:val="17"/>
+              </w:rPr>
+              <w:t>26</w:t>
+            </w:r>
+          </w:p>
+        </w:tc>
+        <w:tc>
+          <w:tcPr>
+            <w:tcW w:type="dxa" w:w="1152"/>
+            <w:vAlign w:val="center"/>
+          </w:tcPr>
+          <w:p>
+            <w:pPr>
+              <w:spacing w:after="0"/>
+            </w:pPr>
+            <w:r/>
+            <w:r>
+              <w:rPr>
+                <w:rFonts w:ascii="Arial" w:hAnsi="Arial" w:eastAsia="Arial"/>
+                <w:b w:val="0"/>
+                <w:i w:val="0"/>
+                <w:sz w:val="17"/>
+              </w:rPr>
+              <w:t>Oct 2026</w:t>
+            </w:r>
+          </w:p>
+        </w:tc>
+        <w:tc>
+          <w:tcPr>
+            <w:tcW w:type="dxa" w:w="1008"/>
+            <w:vAlign w:val="center"/>
+          </w:tcPr>
+          <w:p>
+            <w:pPr>
+              <w:spacing w:after="0"/>
+            </w:pPr>
+            <w:r/>
+            <w:r>
+              <w:rPr>
+                <w:rFonts w:ascii="Arial" w:hAnsi="Arial" w:eastAsia="Arial"/>
+                <w:b w:val="0"/>
+                <w:i w:val="0"/>
+                <w:sz w:val="17"/>
+              </w:rPr>
+              <w:t>Poster</w:t>
+            </w:r>
+          </w:p>
+        </w:tc>
+        <w:tc>
+          <w:tcPr>
+            <w:tcW w:type="dxa" w:w="4464"/>
+            <w:vAlign w:val="center"/>
+          </w:tcPr>
+          <w:p>
+            <w:pPr>
+              <w:spacing w:after="0"/>
+            </w:pPr>
+            <w:r/>
+            <w:r>
+              <w:rPr>
+                <w:rFonts w:ascii="Arial" w:hAnsi="Arial" w:eastAsia="Arial"/>
+                <w:b w:val="0"/>
+                <w:i w:val="0"/>
+                <w:sz w:val="17"/>
+              </w:rPr>
+              <w:t>The Mayo Obesity Staging Index (MOSI): Development of a Staging Framework for Metabolic Surgery</w:t>
+            </w:r>
+          </w:p>
+        </w:tc>
+        <w:tc>
+          <w:tcPr>
+            <w:tcW w:type="dxa" w:w="2880"/>
+            <w:vAlign w:val="center"/>
+          </w:tcPr>
+          <w:p>
+            <w:pPr>
+              <w:spacing w:after="0"/>
+            </w:pPr>
+            <w:r/>
+            <w:r>
+              <w:rPr>
+                <w:rFonts w:ascii="Arial" w:hAnsi="Arial" w:eastAsia="Arial"/>
+                <w:b w:val="0"/>
+                <w:i w:val="0"/>
+                <w:sz w:val="17"/>
+              </w:rPr>
+              <w:t>32nd Annual Balfour Surgery Research Symposium · Poster of Distinction; United States</w:t>
+            </w:r>
+          </w:p>
+        </w:tc>
+      </w:tr>
+      <w:tr>
+        <w:tc>
+          <w:tcPr>
+            <w:tcW w:type="dxa" w:w="504"/>
+            <w:vAlign w:val="center"/>
+          </w:tcPr>
+          <w:p>
+            <w:pPr>
+              <w:spacing w:after="0"/>
+            </w:pPr>
+            <w:r/>
+            <w:r>
+              <w:rPr>
+                <w:rFonts w:ascii="Arial" w:hAnsi="Arial" w:eastAsia="Arial"/>
+                <w:b w:val="0"/>
+                <w:i w:val="0"/>
+                <w:sz w:val="17"/>
+              </w:rPr>
+              <w:t>27</w:t>
+            </w:r>
+          </w:p>
+        </w:tc>
+        <w:tc>
+          <w:tcPr>
+            <w:tcW w:type="dxa" w:w="1152"/>
+            <w:vAlign w:val="center"/>
+          </w:tcPr>
+          <w:p>
+            <w:pPr>
+              <w:spacing w:after="0"/>
+            </w:pPr>
+            <w:r/>
+            <w:r>
+              <w:rPr>
+                <w:rFonts w:ascii="Arial" w:hAnsi="Arial" w:eastAsia="Arial"/>
+                <w:b w:val="0"/>
+                <w:i w:val="0"/>
+                <w:sz w:val="17"/>
+              </w:rPr>
+              <w:t>Oct 2026</w:t>
+            </w:r>
+          </w:p>
+        </w:tc>
+        <w:tc>
+          <w:tcPr>
+            <w:tcW w:type="dxa" w:w="1008"/>
+            <w:vAlign w:val="center"/>
+          </w:tcPr>
+          <w:p>
+            <w:pPr>
+              <w:spacing w:after="0"/>
+            </w:pPr>
+            <w:r/>
+            <w:r>
+              <w:rPr>
+                <w:rFonts w:ascii="Arial" w:hAnsi="Arial" w:eastAsia="Arial"/>
+                <w:b w:val="0"/>
+                <w:i w:val="0"/>
+                <w:sz w:val="17"/>
+              </w:rPr>
+              <w:t>Poster</w:t>
+            </w:r>
+          </w:p>
+        </w:tc>
+        <w:tc>
+          <w:tcPr>
+            <w:tcW w:type="dxa" w:w="4464"/>
+            <w:vAlign w:val="center"/>
+          </w:tcPr>
+          <w:p>
+            <w:pPr>
+              <w:spacing w:after="0"/>
+            </w:pPr>
+            <w:r/>
+            <w:r>
+              <w:rPr>
+                <w:rFonts w:ascii="Arial" w:hAnsi="Arial" w:eastAsia="Arial"/>
+                <w:b w:val="0"/>
+                <w:i w:val="0"/>
+                <w:sz w:val="17"/>
+              </w:rPr>
+              <w:t>Metabolic Surgery Improves Biological Aging as Assessed by AI-Derived Electrocardiogram Age</w:t>
+            </w:r>
+          </w:p>
+        </w:tc>
+        <w:tc>
+          <w:tcPr>
+            <w:tcW w:type="dxa" w:w="2880"/>
+            <w:vAlign w:val="center"/>
+          </w:tcPr>
+          <w:p>
+            <w:pPr>
+              <w:spacing w:after="0"/>
+            </w:pPr>
+            <w:r/>
+            <w:r>
+              <w:rPr>
+                <w:rFonts w:ascii="Arial" w:hAnsi="Arial" w:eastAsia="Arial"/>
+                <w:b w:val="0"/>
+                <w:i w:val="0"/>
+                <w:sz w:val="17"/>
+              </w:rPr>
+              <w:t>32nd Annual Balfour Surgery Research Symposium · Poster of Distinction; United States</w:t>
+            </w:r>
+          </w:p>
+        </w:tc>
+      </w:tr>
     </w:tbl>
     <w:p>
       <w:pPr>

</xml_diff>

<commit_message>
Add ACS Clinical Congress oral presentation (Sep 2026)
Oral presentation "Clinical Features and Outcomes of Microvascular Free Flap
Reconstruction of the Head and Neck" at the American College of Surgeons (ACS)
Clinical Congress, Washington DC (location United States), Sep 2026. Topic:
Plastic & Reconstructive surgery.

Presentations now total 28. Verified: validate + build + smoke pass; in-browser
it renders as an oral talk with the correct date/topic and the filter suite
passes.

Co-Authored-By: Claude Fable 5 <noreply@anthropic.com>
Claude-Session: https://claude.ai/code/session_01Mvoqy98ifTezCDCHR5sSsp
</commit_message>
<xml_diff>
--- a/Shahriarirad_Reza_CV.docx
+++ b/Shahriarirad_Reza_CV.docx
@@ -3355,7 +3355,7 @@
                 <w:i w:val="0"/>
                 <w:sz w:val="17"/>
               </w:rPr>
-              <w:t>27</w:t>
+              <w:t>28</w:t>
             </w:r>
           </w:p>
         </w:tc>
@@ -3443,7 +3443,7 @@
                 <w:i w:val="0"/>
                 <w:sz w:val="17"/>
               </w:rPr>
-              <w:t>2</w:t>
+              <w:t>3</w:t>
             </w:r>
           </w:p>
         </w:tc>
@@ -22297,6 +22297,113 @@
           </w:p>
         </w:tc>
       </w:tr>
+      <w:tr>
+        <w:tc>
+          <w:tcPr>
+            <w:tcW w:type="dxa" w:w="504"/>
+            <w:vAlign w:val="center"/>
+          </w:tcPr>
+          <w:p>
+            <w:pPr>
+              <w:spacing w:after="0"/>
+            </w:pPr>
+            <w:r/>
+            <w:r>
+              <w:rPr>
+                <w:rFonts w:ascii="Arial" w:hAnsi="Arial" w:eastAsia="Arial"/>
+                <w:b w:val="0"/>
+                <w:i w:val="0"/>
+                <w:sz w:val="17"/>
+              </w:rPr>
+              <w:t>28</w:t>
+            </w:r>
+          </w:p>
+        </w:tc>
+        <w:tc>
+          <w:tcPr>
+            <w:tcW w:type="dxa" w:w="1152"/>
+            <w:vAlign w:val="center"/>
+          </w:tcPr>
+          <w:p>
+            <w:pPr>
+              <w:spacing w:after="0"/>
+            </w:pPr>
+            <w:r/>
+            <w:r>
+              <w:rPr>
+                <w:rFonts w:ascii="Arial" w:hAnsi="Arial" w:eastAsia="Arial"/>
+                <w:b w:val="0"/>
+                <w:i w:val="0"/>
+                <w:sz w:val="17"/>
+              </w:rPr>
+              <w:t>Sep 2026</w:t>
+            </w:r>
+          </w:p>
+        </w:tc>
+        <w:tc>
+          <w:tcPr>
+            <w:tcW w:type="dxa" w:w="1008"/>
+            <w:vAlign w:val="center"/>
+          </w:tcPr>
+          <w:p>
+            <w:pPr>
+              <w:spacing w:after="0"/>
+            </w:pPr>
+            <w:r/>
+            <w:r>
+              <w:rPr>
+                <w:rFonts w:ascii="Arial" w:hAnsi="Arial" w:eastAsia="Arial"/>
+                <w:b w:val="0"/>
+                <w:i w:val="0"/>
+                <w:sz w:val="17"/>
+              </w:rPr>
+              <w:t>Oral</w:t>
+            </w:r>
+          </w:p>
+        </w:tc>
+        <w:tc>
+          <w:tcPr>
+            <w:tcW w:type="dxa" w:w="4464"/>
+            <w:vAlign w:val="center"/>
+          </w:tcPr>
+          <w:p>
+            <w:pPr>
+              <w:spacing w:after="0"/>
+            </w:pPr>
+            <w:r/>
+            <w:r>
+              <w:rPr>
+                <w:rFonts w:ascii="Arial" w:hAnsi="Arial" w:eastAsia="Arial"/>
+                <w:b w:val="0"/>
+                <w:i w:val="0"/>
+                <w:sz w:val="17"/>
+              </w:rPr>
+              <w:t>Clinical Features and Outcomes of Microvascular Free Flap Reconstruction of the Head and Neck</w:t>
+            </w:r>
+          </w:p>
+        </w:tc>
+        <w:tc>
+          <w:tcPr>
+            <w:tcW w:type="dxa" w:w="2880"/>
+            <w:vAlign w:val="center"/>
+          </w:tcPr>
+          <w:p>
+            <w:pPr>
+              <w:spacing w:after="0"/>
+            </w:pPr>
+            <w:r/>
+            <w:r>
+              <w:rPr>
+                <w:rFonts w:ascii="Arial" w:hAnsi="Arial" w:eastAsia="Arial"/>
+                <w:b w:val="0"/>
+                <w:i w:val="0"/>
+                <w:sz w:val="17"/>
+              </w:rPr>
+              <w:t>American College of Surgeons (ACS) Clinical Congress; United States</w:t>
+            </w:r>
+          </w:p>
+        </w:tc>
+      </w:tr>
     </w:tbl>
     <w:p>
       <w:pPr>

</xml_diff>

<commit_message>
Use full published title for the myeloma case report (#154)
PubMed (J Med Case Rep. 2023 Feb 10;17(1):42) confirms the complete published
title, so the CV now carries it in full:

  "Extramedullary Relapse of Immunoglobulin A-Kappa Myeloma Manifesting as
   Plasmacytoma of the Pleura without Bone Marrow Involvement and Following
   Autologous Bone Marrow Transplant: A Case Report"

Kept in the CV's Title Case convention rather than PubMed's sentence case, for
consistency with the rest of the publication list.

Everything else on the row already matched the citation and is unchanged:
Feb 2023, Journal of Medical Case Reports, the DOI-resolving link
(10.1186/s13256-023-03765-9), the author order (Reza 2nd), and the co-first tag.
Authorship counts remain 20/25/68/38.

Verified: validate (195 pubs) + build + smoke pass; the full title renders with
no page errors.

Co-Authored-By: Claude Opus 5 <noreply@anthropic.com>
Claude-Session: https://claude.ai/code/session_01Mvoqy98ifTezCDCHR5sSsp
</commit_message>
<xml_diff>
--- a/Shahriarirad_Reza_CV.docx
+++ b/Shahriarirad_Reza_CV.docx
@@ -651,7 +651,7 @@
                 <w:i w:val="0"/>
                 <w:sz w:val="17"/>
               </w:rPr>
-              <w:t>August 05, 2026</w:t>
+              <w:t>August 06, 2026</w:t>
             </w:r>
           </w:p>
         </w:tc>
@@ -15125,7 +15125,7 @@
           <w:i w:val="0"/>
           <w:sz w:val="16"/>
         </w:rPr>
-        <w:t xml:space="preserve"> Extramedullary Relapse of Immunoglobulin A-Kappa Myeloma Manifesting as Plasmacytoma of the Pleura: A Case Report. </w:t>
+        <w:t xml:space="preserve"> Extramedullary Relapse of Immunoglobulin A-Kappa Myeloma Manifesting as Plasmacytoma of the Pleura without Bone Marrow Involvement and Following Autologous Bone Marrow Transplant: A Case Report. </w:t>
       </w:r>
       <w:r>
         <w:rPr>

</xml_diff>